<commit_message>
Day 5 complete - Bandit 11-15
</commit_message>
<xml_diff>
--- a/journey/journal/week1/quizzes_week1.docx
+++ b/journey/journal/week1/quizzes_week1.docx
@@ -41,10 +41,7 @@
     </w:p>
     <w:p>
       <w:r>
-        <w:t xml:space="preserve">Answer: </w:t>
-      </w:r>
-      <w:r>
-        <w:t>find: looking for file /: directory, not sure where though -user bandit7: the user who has the file -group bandit6: the group that has the user we're after -size 33c: the size of the file we're after, 33 bytes (what kind of file though) 2&gt;/dev/null: think it's for forcing a clean output, no secrets?</w:t>
+        <w:t>Answer: find: looking for file /: directory, not sure where though -user bandit7: the user who has the file -group bandit6: the group that has the user we're after -size 33c: the size of the file we're after, 33 bytes (what kind of file though) 2&gt;/dev/null: think it's for forcing a clean output, no secrets?</w:t>
       </w:r>
     </w:p>
     <w:tbl>
@@ -859,6 +856,2115 @@
     </w:p>
     <w:p>
       <w:pPr>
+        <w:pStyle w:val="Heading1"/>
+      </w:pPr>
+      <w:r>
+        <w:t>Day 5 Quiz (Bandit 11–15)</w:t>
+      </w:r>
+    </w:p>
+    <w:p>
+      <w:pPr>
+        <w:spacing w:before="100" w:beforeAutospacing="1" w:after="100" w:afterAutospacing="1" w:line="240" w:lineRule="auto"/>
+        <w:rPr>
+          <w:rFonts w:ascii="Times New Roman" w:eastAsia="Times New Roman" w:hAnsi="Times New Roman" w:cs="Times New Roman"/>
+          <w:sz w:val="24"/>
+          <w:szCs w:val="24"/>
+        </w:rPr>
+      </w:pPr>
+      <w:r>
+        <w:rPr>
+          <w:rFonts w:ascii="Times New Roman" w:eastAsia="Times New Roman" w:hAnsi="Times New Roman" w:cs="Times New Roman"/>
+          <w:b/>
+          <w:bCs/>
+          <w:sz w:val="24"/>
+          <w:szCs w:val="24"/>
+        </w:rPr>
+        <w:t>1. What does the </w:t>
+      </w:r>
+      <w:r>
+        <w:rPr>
+          <w:rFonts w:ascii="Times New Roman" w:eastAsia="Times New Roman" w:hAnsi="Times New Roman" w:cs="Times New Roman"/>
+          <w:sz w:val="24"/>
+          <w:szCs w:val="24"/>
+        </w:rPr>
+        <w:t>base64 -d</w:t>
+      </w:r>
+      <w:r>
+        <w:rPr>
+          <w:rFonts w:ascii="Times New Roman" w:eastAsia="Times New Roman" w:hAnsi="Times New Roman" w:cs="Times New Roman"/>
+          <w:b/>
+          <w:bCs/>
+          <w:sz w:val="24"/>
+          <w:szCs w:val="24"/>
+        </w:rPr>
+        <w:t> command do?</w:t>
+      </w:r>
+      <w:r>
+        <w:rPr>
+          <w:rFonts w:ascii="Times New Roman" w:eastAsia="Times New Roman" w:hAnsi="Times New Roman" w:cs="Times New Roman"/>
+          <w:b/>
+          <w:bCs/>
+          <w:sz w:val="24"/>
+          <w:szCs w:val="24"/>
+        </w:rPr>
+        <w:t xml:space="preserve"> </w:t>
+      </w:r>
+      <w:r>
+        <w:rPr>
+          <w:rFonts w:ascii="Times New Roman" w:eastAsia="Times New Roman" w:hAnsi="Times New Roman" w:cs="Times New Roman"/>
+          <w:sz w:val="24"/>
+          <w:szCs w:val="24"/>
+        </w:rPr>
+        <w:t>Decodes messages to become readable/accessible.</w:t>
+      </w:r>
+    </w:p>
+    <w:p>
+      <w:pPr>
+        <w:spacing w:before="100" w:beforeAutospacing="1" w:after="100" w:afterAutospacing="1" w:line="240" w:lineRule="auto"/>
+        <w:rPr>
+          <w:rFonts w:ascii="Times New Roman" w:eastAsia="Times New Roman" w:hAnsi="Times New Roman" w:cs="Times New Roman"/>
+          <w:sz w:val="24"/>
+          <w:szCs w:val="24"/>
+        </w:rPr>
+      </w:pPr>
+      <w:r>
+        <w:rPr>
+          <w:rFonts w:ascii="Times New Roman" w:eastAsia="Times New Roman" w:hAnsi="Times New Roman" w:cs="Times New Roman"/>
+          <w:b/>
+          <w:bCs/>
+          <w:sz w:val="24"/>
+          <w:szCs w:val="24"/>
+        </w:rPr>
+        <w:t>2. Which command would you use to decode a file that has been shifted by 13 letters (ROT13)?</w:t>
+      </w:r>
+      <w:r>
+        <w:rPr>
+          <w:rFonts w:ascii="Times New Roman" w:eastAsia="Times New Roman" w:hAnsi="Times New Roman" w:cs="Times New Roman"/>
+          <w:b/>
+          <w:bCs/>
+          <w:sz w:val="24"/>
+          <w:szCs w:val="24"/>
+        </w:rPr>
+        <w:t xml:space="preserve"> </w:t>
+      </w:r>
+      <w:r>
+        <w:rPr>
+          <w:rFonts w:ascii="Times New Roman" w:eastAsia="Times New Roman" w:hAnsi="Times New Roman" w:cs="Times New Roman"/>
+          <w:sz w:val="24"/>
+          <w:szCs w:val="24"/>
+        </w:rPr>
+        <w:t>tr</w:t>
+      </w:r>
+    </w:p>
+    <w:p>
+      <w:pPr>
+        <w:spacing w:before="100" w:beforeAutospacing="1" w:after="100" w:afterAutospacing="1" w:line="240" w:lineRule="auto"/>
+        <w:rPr>
+          <w:rFonts w:ascii="Times New Roman" w:eastAsia="Times New Roman" w:hAnsi="Times New Roman" w:cs="Times New Roman"/>
+          <w:sz w:val="24"/>
+          <w:szCs w:val="24"/>
+        </w:rPr>
+      </w:pPr>
+      <w:r>
+        <w:rPr>
+          <w:rFonts w:ascii="Times New Roman" w:eastAsia="Times New Roman" w:hAnsi="Times New Roman" w:cs="Times New Roman"/>
+          <w:b/>
+          <w:bCs/>
+          <w:sz w:val="24"/>
+          <w:szCs w:val="24"/>
+        </w:rPr>
+        <w:t>3. What does </w:t>
+      </w:r>
+      <w:proofErr w:type="spellStart"/>
+      <w:r>
+        <w:rPr>
+          <w:rFonts w:ascii="Times New Roman" w:eastAsia="Times New Roman" w:hAnsi="Times New Roman" w:cs="Times New Roman"/>
+          <w:sz w:val="24"/>
+          <w:szCs w:val="24"/>
+        </w:rPr>
+        <w:t>xxd</w:t>
+      </w:r>
+      <w:proofErr w:type="spellEnd"/>
+      <w:r>
+        <w:rPr>
+          <w:rFonts w:ascii="Times New Roman" w:eastAsia="Times New Roman" w:hAnsi="Times New Roman" w:cs="Times New Roman"/>
+          <w:sz w:val="24"/>
+          <w:szCs w:val="24"/>
+        </w:rPr>
+        <w:t xml:space="preserve"> -r</w:t>
+      </w:r>
+      <w:r>
+        <w:rPr>
+          <w:rFonts w:ascii="Times New Roman" w:eastAsia="Times New Roman" w:hAnsi="Times New Roman" w:cs="Times New Roman"/>
+          <w:b/>
+          <w:bCs/>
+          <w:sz w:val="24"/>
+          <w:szCs w:val="24"/>
+        </w:rPr>
+        <w:t> do?</w:t>
+      </w:r>
+      <w:r>
+        <w:rPr>
+          <w:rFonts w:ascii="Times New Roman" w:eastAsia="Times New Roman" w:hAnsi="Times New Roman" w:cs="Times New Roman"/>
+          <w:b/>
+          <w:bCs/>
+          <w:sz w:val="24"/>
+          <w:szCs w:val="24"/>
+        </w:rPr>
+        <w:t xml:space="preserve"> </w:t>
+      </w:r>
+      <w:r>
+        <w:rPr>
+          <w:rFonts w:ascii="Times New Roman" w:eastAsia="Times New Roman" w:hAnsi="Times New Roman" w:cs="Times New Roman"/>
+          <w:sz w:val="24"/>
+          <w:szCs w:val="24"/>
+        </w:rPr>
+        <w:t xml:space="preserve">When there’s </w:t>
+      </w:r>
+      <w:proofErr w:type="spellStart"/>
+      <w:r>
+        <w:rPr>
+          <w:rFonts w:ascii="Times New Roman" w:eastAsia="Times New Roman" w:hAnsi="Times New Roman" w:cs="Times New Roman"/>
+          <w:sz w:val="24"/>
+          <w:szCs w:val="24"/>
+        </w:rPr>
+        <w:t>hexfile</w:t>
+      </w:r>
+      <w:proofErr w:type="spellEnd"/>
+      <w:r>
+        <w:rPr>
+          <w:rFonts w:ascii="Times New Roman" w:eastAsia="Times New Roman" w:hAnsi="Times New Roman" w:cs="Times New Roman"/>
+          <w:sz w:val="24"/>
+          <w:szCs w:val="24"/>
+        </w:rPr>
+        <w:t xml:space="preserve"> I use it in order to access it</w:t>
+      </w:r>
+    </w:p>
+    <w:p>
+      <w:pPr>
+        <w:spacing w:before="100" w:beforeAutospacing="1" w:after="100" w:afterAutospacing="1" w:line="240" w:lineRule="auto"/>
+        <w:rPr>
+          <w:rFonts w:ascii="Times New Roman" w:eastAsia="Times New Roman" w:hAnsi="Times New Roman" w:cs="Times New Roman"/>
+          <w:sz w:val="24"/>
+          <w:szCs w:val="24"/>
+        </w:rPr>
+      </w:pPr>
+      <w:r>
+        <w:rPr>
+          <w:rFonts w:ascii="Times New Roman" w:eastAsia="Times New Roman" w:hAnsi="Times New Roman" w:cs="Times New Roman"/>
+          <w:b/>
+          <w:bCs/>
+          <w:sz w:val="24"/>
+          <w:szCs w:val="24"/>
+        </w:rPr>
+        <w:t>4. When you run </w:t>
+      </w:r>
+      <w:r>
+        <w:rPr>
+          <w:rFonts w:ascii="Times New Roman" w:eastAsia="Times New Roman" w:hAnsi="Times New Roman" w:cs="Times New Roman"/>
+          <w:sz w:val="24"/>
+          <w:szCs w:val="24"/>
+        </w:rPr>
+        <w:t>file data</w:t>
+      </w:r>
+      <w:r>
+        <w:rPr>
+          <w:rFonts w:ascii="Times New Roman" w:eastAsia="Times New Roman" w:hAnsi="Times New Roman" w:cs="Times New Roman"/>
+          <w:b/>
+          <w:bCs/>
+          <w:sz w:val="24"/>
+          <w:szCs w:val="24"/>
+        </w:rPr>
+        <w:t> and it says </w:t>
+      </w:r>
+      <w:proofErr w:type="spellStart"/>
+      <w:r>
+        <w:rPr>
+          <w:rFonts w:ascii="Times New Roman" w:eastAsia="Times New Roman" w:hAnsi="Times New Roman" w:cs="Times New Roman"/>
+          <w:sz w:val="24"/>
+          <w:szCs w:val="24"/>
+        </w:rPr>
+        <w:t>gzip</w:t>
+      </w:r>
+      <w:proofErr w:type="spellEnd"/>
+      <w:r>
+        <w:rPr>
+          <w:rFonts w:ascii="Times New Roman" w:eastAsia="Times New Roman" w:hAnsi="Times New Roman" w:cs="Times New Roman"/>
+          <w:sz w:val="24"/>
+          <w:szCs w:val="24"/>
+        </w:rPr>
+        <w:t xml:space="preserve"> compressed data</w:t>
+      </w:r>
+      <w:r>
+        <w:rPr>
+          <w:rFonts w:ascii="Times New Roman" w:eastAsia="Times New Roman" w:hAnsi="Times New Roman" w:cs="Times New Roman"/>
+          <w:b/>
+          <w:bCs/>
+          <w:sz w:val="24"/>
+          <w:szCs w:val="24"/>
+        </w:rPr>
+        <w:t>, what is the next step?</w:t>
+      </w:r>
+      <w:r>
+        <w:rPr>
+          <w:rFonts w:ascii="Times New Roman" w:eastAsia="Times New Roman" w:hAnsi="Times New Roman" w:cs="Times New Roman"/>
+          <w:b/>
+          <w:bCs/>
+          <w:sz w:val="24"/>
+          <w:szCs w:val="24"/>
+        </w:rPr>
+        <w:t xml:space="preserve"> </w:t>
+      </w:r>
+      <w:r>
+        <w:rPr>
+          <w:rFonts w:ascii="Times New Roman" w:eastAsia="Times New Roman" w:hAnsi="Times New Roman" w:cs="Times New Roman"/>
+          <w:sz w:val="24"/>
+          <w:szCs w:val="24"/>
+        </w:rPr>
+        <w:t xml:space="preserve">I decompress the data using </w:t>
+      </w:r>
+      <w:proofErr w:type="spellStart"/>
+      <w:r>
+        <w:rPr>
+          <w:rFonts w:ascii="Times New Roman" w:eastAsia="Times New Roman" w:hAnsi="Times New Roman" w:cs="Times New Roman"/>
+          <w:sz w:val="24"/>
+          <w:szCs w:val="24"/>
+        </w:rPr>
+        <w:t>gz</w:t>
+      </w:r>
+      <w:proofErr w:type="spellEnd"/>
+      <w:r>
+        <w:rPr>
+          <w:rFonts w:ascii="Times New Roman" w:eastAsia="Times New Roman" w:hAnsi="Times New Roman" w:cs="Times New Roman"/>
+          <w:sz w:val="24"/>
+          <w:szCs w:val="24"/>
+        </w:rPr>
+        <w:t xml:space="preserve"> -d command.</w:t>
+      </w:r>
+    </w:p>
+    <w:p>
+      <w:pPr>
+        <w:spacing w:before="100" w:beforeAutospacing="1" w:after="100" w:afterAutospacing="1" w:line="240" w:lineRule="auto"/>
+        <w:rPr>
+          <w:rFonts w:ascii="Times New Roman" w:eastAsia="Times New Roman" w:hAnsi="Times New Roman" w:cs="Times New Roman"/>
+          <w:sz w:val="24"/>
+          <w:szCs w:val="24"/>
+        </w:rPr>
+      </w:pPr>
+      <w:r>
+        <w:rPr>
+          <w:rFonts w:ascii="Times New Roman" w:eastAsia="Times New Roman" w:hAnsi="Times New Roman" w:cs="Times New Roman"/>
+          <w:b/>
+          <w:bCs/>
+          <w:sz w:val="24"/>
+          <w:szCs w:val="24"/>
+        </w:rPr>
+        <w:t>5. What does the </w:t>
+      </w:r>
+      <w:r>
+        <w:rPr>
+          <w:rFonts w:ascii="Times New Roman" w:eastAsia="Times New Roman" w:hAnsi="Times New Roman" w:cs="Times New Roman"/>
+          <w:sz w:val="24"/>
+          <w:szCs w:val="24"/>
+        </w:rPr>
+        <w:t>-</w:t>
+      </w:r>
+      <w:proofErr w:type="spellStart"/>
+      <w:r>
+        <w:rPr>
+          <w:rFonts w:ascii="Times New Roman" w:eastAsia="Times New Roman" w:hAnsi="Times New Roman" w:cs="Times New Roman"/>
+          <w:sz w:val="24"/>
+          <w:szCs w:val="24"/>
+        </w:rPr>
+        <w:t>i</w:t>
+      </w:r>
+      <w:proofErr w:type="spellEnd"/>
+      <w:r>
+        <w:rPr>
+          <w:rFonts w:ascii="Times New Roman" w:eastAsia="Times New Roman" w:hAnsi="Times New Roman" w:cs="Times New Roman"/>
+          <w:b/>
+          <w:bCs/>
+          <w:sz w:val="24"/>
+          <w:szCs w:val="24"/>
+        </w:rPr>
+        <w:t> flag do in the </w:t>
+      </w:r>
+      <w:proofErr w:type="spellStart"/>
+      <w:r>
+        <w:rPr>
+          <w:rFonts w:ascii="Times New Roman" w:eastAsia="Times New Roman" w:hAnsi="Times New Roman" w:cs="Times New Roman"/>
+          <w:sz w:val="24"/>
+          <w:szCs w:val="24"/>
+        </w:rPr>
+        <w:t>ssh</w:t>
+      </w:r>
+      <w:proofErr w:type="spellEnd"/>
+      <w:r>
+        <w:rPr>
+          <w:rFonts w:ascii="Times New Roman" w:eastAsia="Times New Roman" w:hAnsi="Times New Roman" w:cs="Times New Roman"/>
+          <w:b/>
+          <w:bCs/>
+          <w:sz w:val="24"/>
+          <w:szCs w:val="24"/>
+        </w:rPr>
+        <w:t> command?</w:t>
+      </w:r>
+      <w:r>
+        <w:rPr>
+          <w:rFonts w:ascii="Times New Roman" w:eastAsia="Times New Roman" w:hAnsi="Times New Roman" w:cs="Times New Roman"/>
+          <w:b/>
+          <w:bCs/>
+          <w:sz w:val="24"/>
+          <w:szCs w:val="24"/>
+        </w:rPr>
+        <w:t xml:space="preserve"> </w:t>
+      </w:r>
+      <w:r>
+        <w:rPr>
+          <w:rFonts w:ascii="Times New Roman" w:eastAsia="Times New Roman" w:hAnsi="Times New Roman" w:cs="Times New Roman"/>
+          <w:sz w:val="24"/>
+          <w:szCs w:val="24"/>
+        </w:rPr>
+        <w:t>Connect to a remote server using a passkey</w:t>
+      </w:r>
+    </w:p>
+    <w:p>
+      <w:pPr>
+        <w:spacing w:before="100" w:beforeAutospacing="1" w:after="100" w:afterAutospacing="1" w:line="240" w:lineRule="auto"/>
+        <w:rPr>
+          <w:rFonts w:ascii="Times New Roman" w:eastAsia="Times New Roman" w:hAnsi="Times New Roman" w:cs="Times New Roman"/>
+          <w:sz w:val="24"/>
+          <w:szCs w:val="24"/>
+        </w:rPr>
+      </w:pPr>
+      <w:r>
+        <w:rPr>
+          <w:rFonts w:ascii="Times New Roman" w:eastAsia="Times New Roman" w:hAnsi="Times New Roman" w:cs="Times New Roman"/>
+          <w:b/>
+          <w:bCs/>
+          <w:sz w:val="24"/>
+          <w:szCs w:val="24"/>
+        </w:rPr>
+        <w:t xml:space="preserve">6. What is </w:t>
+      </w:r>
+      <w:proofErr w:type="spellStart"/>
+      <w:r>
+        <w:rPr>
+          <w:rFonts w:ascii="Times New Roman" w:eastAsia="Times New Roman" w:hAnsi="Times New Roman" w:cs="Times New Roman"/>
+          <w:b/>
+          <w:bCs/>
+          <w:sz w:val="24"/>
+          <w:szCs w:val="24"/>
+        </w:rPr>
+        <w:t>netcat</w:t>
+      </w:r>
+      <w:proofErr w:type="spellEnd"/>
+      <w:r>
+        <w:rPr>
+          <w:rFonts w:ascii="Times New Roman" w:eastAsia="Times New Roman" w:hAnsi="Times New Roman" w:cs="Times New Roman"/>
+          <w:b/>
+          <w:bCs/>
+          <w:sz w:val="24"/>
+          <w:szCs w:val="24"/>
+        </w:rPr>
+        <w:t xml:space="preserve"> (</w:t>
+      </w:r>
+      <w:proofErr w:type="spellStart"/>
+      <w:r>
+        <w:rPr>
+          <w:rFonts w:ascii="Times New Roman" w:eastAsia="Times New Roman" w:hAnsi="Times New Roman" w:cs="Times New Roman"/>
+          <w:sz w:val="24"/>
+          <w:szCs w:val="24"/>
+        </w:rPr>
+        <w:t>nc</w:t>
+      </w:r>
+      <w:proofErr w:type="spellEnd"/>
+      <w:r>
+        <w:rPr>
+          <w:rFonts w:ascii="Times New Roman" w:eastAsia="Times New Roman" w:hAnsi="Times New Roman" w:cs="Times New Roman"/>
+          <w:b/>
+          <w:bCs/>
+          <w:sz w:val="24"/>
+          <w:szCs w:val="24"/>
+        </w:rPr>
+        <w:t>) used for?</w:t>
+      </w:r>
+      <w:r>
+        <w:rPr>
+          <w:rFonts w:ascii="Times New Roman" w:eastAsia="Times New Roman" w:hAnsi="Times New Roman" w:cs="Times New Roman"/>
+          <w:b/>
+          <w:bCs/>
+          <w:sz w:val="24"/>
+          <w:szCs w:val="24"/>
+        </w:rPr>
+        <w:t xml:space="preserve"> </w:t>
+      </w:r>
+      <w:r>
+        <w:rPr>
+          <w:rFonts w:ascii="Times New Roman" w:eastAsia="Times New Roman" w:hAnsi="Times New Roman" w:cs="Times New Roman"/>
+          <w:sz w:val="24"/>
+          <w:szCs w:val="24"/>
+        </w:rPr>
+        <w:t>to connect to different ports and listen in</w:t>
+      </w:r>
+    </w:p>
+    <w:p>
+      <w:pPr>
+        <w:spacing w:before="100" w:beforeAutospacing="1" w:after="100" w:afterAutospacing="1" w:line="240" w:lineRule="auto"/>
+        <w:rPr>
+          <w:rFonts w:ascii="Times New Roman" w:eastAsia="Times New Roman" w:hAnsi="Times New Roman" w:cs="Times New Roman"/>
+          <w:sz w:val="24"/>
+          <w:szCs w:val="24"/>
+        </w:rPr>
+      </w:pPr>
+      <w:r>
+        <w:rPr>
+          <w:rFonts w:ascii="Times New Roman" w:eastAsia="Times New Roman" w:hAnsi="Times New Roman" w:cs="Times New Roman"/>
+          <w:b/>
+          <w:bCs/>
+          <w:sz w:val="24"/>
+          <w:szCs w:val="24"/>
+        </w:rPr>
+        <w:t>7. Why did you need to set </w:t>
+      </w:r>
+      <w:proofErr w:type="spellStart"/>
+      <w:r>
+        <w:rPr>
+          <w:rFonts w:ascii="Times New Roman" w:eastAsia="Times New Roman" w:hAnsi="Times New Roman" w:cs="Times New Roman"/>
+          <w:sz w:val="24"/>
+          <w:szCs w:val="24"/>
+        </w:rPr>
+        <w:t>chmod</w:t>
+      </w:r>
+      <w:proofErr w:type="spellEnd"/>
+      <w:r>
+        <w:rPr>
+          <w:rFonts w:ascii="Times New Roman" w:eastAsia="Times New Roman" w:hAnsi="Times New Roman" w:cs="Times New Roman"/>
+          <w:sz w:val="24"/>
+          <w:szCs w:val="24"/>
+        </w:rPr>
+        <w:t xml:space="preserve"> 600</w:t>
+      </w:r>
+      <w:r>
+        <w:rPr>
+          <w:rFonts w:ascii="Times New Roman" w:eastAsia="Times New Roman" w:hAnsi="Times New Roman" w:cs="Times New Roman"/>
+          <w:b/>
+          <w:bCs/>
+          <w:sz w:val="24"/>
+          <w:szCs w:val="24"/>
+        </w:rPr>
+        <w:t> on the </w:t>
+      </w:r>
+      <w:proofErr w:type="spellStart"/>
+      <w:proofErr w:type="gramStart"/>
+      <w:r>
+        <w:rPr>
+          <w:rFonts w:ascii="Times New Roman" w:eastAsia="Times New Roman" w:hAnsi="Times New Roman" w:cs="Times New Roman"/>
+          <w:sz w:val="24"/>
+          <w:szCs w:val="24"/>
+        </w:rPr>
+        <w:t>sshkey.private</w:t>
+      </w:r>
+      <w:proofErr w:type="spellEnd"/>
+      <w:proofErr w:type="gramEnd"/>
+      <w:r>
+        <w:rPr>
+          <w:rFonts w:ascii="Times New Roman" w:eastAsia="Times New Roman" w:hAnsi="Times New Roman" w:cs="Times New Roman"/>
+          <w:b/>
+          <w:bCs/>
+          <w:sz w:val="24"/>
+          <w:szCs w:val="24"/>
+        </w:rPr>
+        <w:t> file?</w:t>
+      </w:r>
+      <w:r>
+        <w:rPr>
+          <w:rFonts w:ascii="Times New Roman" w:eastAsia="Times New Roman" w:hAnsi="Times New Roman" w:cs="Times New Roman"/>
+          <w:b/>
+          <w:bCs/>
+          <w:sz w:val="24"/>
+          <w:szCs w:val="24"/>
+        </w:rPr>
+        <w:t xml:space="preserve"> </w:t>
+      </w:r>
+      <w:r>
+        <w:rPr>
+          <w:rFonts w:ascii="Times New Roman" w:eastAsia="Times New Roman" w:hAnsi="Times New Roman" w:cs="Times New Roman"/>
+          <w:sz w:val="24"/>
+          <w:szCs w:val="24"/>
+        </w:rPr>
+        <w:t>To change file’s permission to only me who can change/read it so that bandit server would accept it</w:t>
+      </w:r>
+    </w:p>
+    <w:p>
+      <w:pPr>
+        <w:spacing w:before="100" w:beforeAutospacing="1" w:after="100" w:afterAutospacing="1" w:line="240" w:lineRule="auto"/>
+        <w:rPr>
+          <w:rFonts w:ascii="Times New Roman" w:eastAsia="Times New Roman" w:hAnsi="Times New Roman" w:cs="Times New Roman"/>
+          <w:sz w:val="24"/>
+          <w:szCs w:val="24"/>
+        </w:rPr>
+      </w:pPr>
+      <w:r>
+        <w:rPr>
+          <w:rFonts w:ascii="Times New Roman" w:eastAsia="Times New Roman" w:hAnsi="Times New Roman" w:cs="Times New Roman"/>
+          <w:b/>
+          <w:bCs/>
+          <w:sz w:val="24"/>
+          <w:szCs w:val="24"/>
+        </w:rPr>
+        <w:t>8. True or False: Base64 is a form of encryption.</w:t>
+      </w:r>
+      <w:r>
+        <w:rPr>
+          <w:rFonts w:ascii="Times New Roman" w:eastAsia="Times New Roman" w:hAnsi="Times New Roman" w:cs="Times New Roman"/>
+          <w:b/>
+          <w:bCs/>
+          <w:sz w:val="24"/>
+          <w:szCs w:val="24"/>
+        </w:rPr>
+        <w:t xml:space="preserve"> </w:t>
+      </w:r>
+      <w:r>
+        <w:rPr>
+          <w:rFonts w:ascii="Times New Roman" w:eastAsia="Times New Roman" w:hAnsi="Times New Roman" w:cs="Times New Roman"/>
+          <w:sz w:val="24"/>
+          <w:szCs w:val="24"/>
+        </w:rPr>
+        <w:t>false</w:t>
+      </w:r>
+    </w:p>
+    <w:p>
+      <w:pPr>
+        <w:spacing w:before="100" w:beforeAutospacing="1" w:after="100" w:afterAutospacing="1" w:line="240" w:lineRule="auto"/>
+        <w:rPr>
+          <w:rFonts w:ascii="Times New Roman" w:eastAsia="Times New Roman" w:hAnsi="Times New Roman" w:cs="Times New Roman"/>
+          <w:sz w:val="24"/>
+          <w:szCs w:val="24"/>
+        </w:rPr>
+      </w:pPr>
+      <w:r>
+        <w:rPr>
+          <w:rFonts w:ascii="Times New Roman" w:eastAsia="Times New Roman" w:hAnsi="Times New Roman" w:cs="Times New Roman"/>
+          <w:b/>
+          <w:bCs/>
+          <w:sz w:val="24"/>
+          <w:szCs w:val="24"/>
+        </w:rPr>
+        <w:t>9. What is the purpose of creating a temporary directory with </w:t>
+      </w:r>
+      <w:proofErr w:type="spellStart"/>
+      <w:r>
+        <w:rPr>
+          <w:rFonts w:ascii="Times New Roman" w:eastAsia="Times New Roman" w:hAnsi="Times New Roman" w:cs="Times New Roman"/>
+          <w:sz w:val="24"/>
+          <w:szCs w:val="24"/>
+        </w:rPr>
+        <w:t>mktemp</w:t>
+      </w:r>
+      <w:proofErr w:type="spellEnd"/>
+      <w:r>
+        <w:rPr>
+          <w:rFonts w:ascii="Times New Roman" w:eastAsia="Times New Roman" w:hAnsi="Times New Roman" w:cs="Times New Roman"/>
+          <w:sz w:val="24"/>
+          <w:szCs w:val="24"/>
+        </w:rPr>
+        <w:t xml:space="preserve"> -d</w:t>
+      </w:r>
+      <w:r>
+        <w:rPr>
+          <w:rFonts w:ascii="Times New Roman" w:eastAsia="Times New Roman" w:hAnsi="Times New Roman" w:cs="Times New Roman"/>
+          <w:b/>
+          <w:bCs/>
+          <w:sz w:val="24"/>
+          <w:szCs w:val="24"/>
+        </w:rPr>
+        <w:t>?</w:t>
+      </w:r>
+      <w:r>
+        <w:rPr>
+          <w:rFonts w:ascii="Times New Roman" w:eastAsia="Times New Roman" w:hAnsi="Times New Roman" w:cs="Times New Roman"/>
+          <w:b/>
+          <w:bCs/>
+          <w:sz w:val="24"/>
+          <w:szCs w:val="24"/>
+        </w:rPr>
+        <w:t xml:space="preserve"> </w:t>
+      </w:r>
+      <w:r>
+        <w:rPr>
+          <w:rFonts w:ascii="Times New Roman" w:eastAsia="Times New Roman" w:hAnsi="Times New Roman" w:cs="Times New Roman"/>
+          <w:sz w:val="24"/>
+          <w:szCs w:val="24"/>
+        </w:rPr>
+        <w:t>so that it can be removed automatically later after using it and be done with it.</w:t>
+      </w:r>
+    </w:p>
+    <w:p>
+      <w:pPr>
+        <w:spacing w:before="100" w:beforeAutospacing="1" w:after="100" w:afterAutospacing="1" w:line="240" w:lineRule="auto"/>
+        <w:rPr>
+          <w:rFonts w:ascii="Times New Roman" w:eastAsia="Times New Roman" w:hAnsi="Times New Roman" w:cs="Times New Roman"/>
+          <w:sz w:val="24"/>
+          <w:szCs w:val="24"/>
+        </w:rPr>
+      </w:pPr>
+      <w:r>
+        <w:rPr>
+          <w:rFonts w:ascii="Times New Roman" w:eastAsia="Times New Roman" w:hAnsi="Times New Roman" w:cs="Times New Roman"/>
+          <w:b/>
+          <w:bCs/>
+          <w:sz w:val="24"/>
+          <w:szCs w:val="24"/>
+        </w:rPr>
+        <w:lastRenderedPageBreak/>
+        <w:t>10. Name one real</w:t>
+      </w:r>
+      <w:r>
+        <w:rPr>
+          <w:rFonts w:ascii="Times New Roman" w:eastAsia="Times New Roman" w:hAnsi="Times New Roman" w:cs="Times New Roman"/>
+          <w:b/>
+          <w:bCs/>
+          <w:sz w:val="24"/>
+          <w:szCs w:val="24"/>
+        </w:rPr>
+        <w:noBreakHyphen/>
+        <w:t>world situation where you would use </w:t>
+      </w:r>
+      <w:r>
+        <w:rPr>
+          <w:rFonts w:ascii="Times New Roman" w:eastAsia="Times New Roman" w:hAnsi="Times New Roman" w:cs="Times New Roman"/>
+          <w:sz w:val="24"/>
+          <w:szCs w:val="24"/>
+        </w:rPr>
+        <w:t>strings</w:t>
+      </w:r>
+      <w:r>
+        <w:rPr>
+          <w:rFonts w:ascii="Times New Roman" w:eastAsia="Times New Roman" w:hAnsi="Times New Roman" w:cs="Times New Roman"/>
+          <w:b/>
+          <w:bCs/>
+          <w:sz w:val="24"/>
+          <w:szCs w:val="24"/>
+        </w:rPr>
+        <w:t> or </w:t>
+      </w:r>
+      <w:r>
+        <w:rPr>
+          <w:rFonts w:ascii="Times New Roman" w:eastAsia="Times New Roman" w:hAnsi="Times New Roman" w:cs="Times New Roman"/>
+          <w:sz w:val="24"/>
+          <w:szCs w:val="24"/>
+        </w:rPr>
+        <w:t>base64</w:t>
+      </w:r>
+      <w:r>
+        <w:rPr>
+          <w:rFonts w:ascii="Times New Roman" w:eastAsia="Times New Roman" w:hAnsi="Times New Roman" w:cs="Times New Roman"/>
+          <w:b/>
+          <w:bCs/>
+          <w:sz w:val="24"/>
+          <w:szCs w:val="24"/>
+        </w:rPr>
+        <w:t>.</w:t>
+      </w:r>
+      <w:r>
+        <w:rPr>
+          <w:rFonts w:ascii="Times New Roman" w:eastAsia="Times New Roman" w:hAnsi="Times New Roman" w:cs="Times New Roman"/>
+          <w:b/>
+          <w:bCs/>
+          <w:sz w:val="24"/>
+          <w:szCs w:val="24"/>
+        </w:rPr>
+        <w:t xml:space="preserve"> </w:t>
+      </w:r>
+      <w:r>
+        <w:rPr>
+          <w:rFonts w:ascii="Times New Roman" w:eastAsia="Times New Roman" w:hAnsi="Times New Roman" w:cs="Times New Roman"/>
+          <w:sz w:val="24"/>
+          <w:szCs w:val="24"/>
+        </w:rPr>
+        <w:t>Filtering and decoding,</w:t>
+      </w:r>
+      <w:r>
+        <w:rPr>
+          <w:rFonts w:ascii="Times New Roman" w:eastAsia="Times New Roman" w:hAnsi="Times New Roman" w:cs="Times New Roman"/>
+          <w:b/>
+          <w:bCs/>
+          <w:sz w:val="24"/>
+          <w:szCs w:val="24"/>
+        </w:rPr>
+        <w:t xml:space="preserve"> </w:t>
+      </w:r>
+      <w:r>
+        <w:rPr>
+          <w:rFonts w:ascii="Times New Roman" w:eastAsia="Times New Roman" w:hAnsi="Times New Roman" w:cs="Times New Roman"/>
+          <w:sz w:val="24"/>
+          <w:szCs w:val="24"/>
+        </w:rPr>
+        <w:t>when filtering for useful data, and when decoding important data.</w:t>
+      </w:r>
+    </w:p>
+    <w:p>
+      <w:pPr>
+        <w:spacing w:before="100" w:beforeAutospacing="1" w:after="100" w:afterAutospacing="1" w:line="240" w:lineRule="auto"/>
+        <w:rPr>
+          <w:rFonts w:ascii="Times New Roman" w:eastAsia="Times New Roman" w:hAnsi="Times New Roman" w:cs="Times New Roman"/>
+          <w:sz w:val="24"/>
+          <w:szCs w:val="24"/>
+        </w:rPr>
+      </w:pPr>
+      <w:r>
+        <w:rPr>
+          <w:rFonts w:ascii="Times New Roman" w:eastAsia="Times New Roman" w:hAnsi="Times New Roman" w:cs="Times New Roman"/>
+          <w:sz w:val="24"/>
+          <w:szCs w:val="24"/>
+        </w:rPr>
+        <w:pict w14:anchorId="2D8D71EE">
+          <v:rect id="_x0000_i1038" style="width:0;height:.75pt" o:hralign="center" o:hrstd="t" o:hr="t" fillcolor="#a0a0a0" stroked="f"/>
+        </w:pict>
+      </w:r>
+    </w:p>
+    <w:p>
+      <w:pPr>
+        <w:pStyle w:val="Heading2"/>
+      </w:pPr>
+      <w:r>
+        <w:t>Feedback on Your Answers</w:t>
+      </w:r>
+    </w:p>
+    <w:p>
+      <w:r>
+        <w:t>Excellent work. You clearly understand the concepts — your answers are honest and show you grasped the material. You scored </w:t>
+      </w:r>
+      <w:r>
+        <w:rPr>
+          <w:b/>
+          <w:bCs/>
+        </w:rPr>
+        <w:t>10/10</w:t>
+      </w:r>
+      <w:r>
+        <w:t>.</w:t>
+      </w:r>
+    </w:p>
+    <w:tbl>
+      <w:tblPr>
+        <w:tblW w:w="11280" w:type="dxa"/>
+        <w:tblCellMar>
+          <w:top w:w="15" w:type="dxa"/>
+          <w:left w:w="15" w:type="dxa"/>
+          <w:bottom w:w="15" w:type="dxa"/>
+          <w:right w:w="15" w:type="dxa"/>
+        </w:tblCellMar>
+        <w:tblLook w:val="04A0" w:firstRow="1" w:lastRow="0" w:firstColumn="1" w:lastColumn="0" w:noHBand="0" w:noVBand="1"/>
+      </w:tblPr>
+      <w:tblGrid>
+        <w:gridCol w:w="480"/>
+        <w:gridCol w:w="5673"/>
+        <w:gridCol w:w="5127"/>
+      </w:tblGrid>
+      <w:tr>
+        <w:trPr>
+          <w:tblHeader/>
+        </w:trPr>
+        <w:tc>
+          <w:tcPr>
+            <w:tcW w:w="0" w:type="auto"/>
+            <w:tcBorders>
+              <w:top w:val="nil"/>
+            </w:tcBorders>
+            <w:tcMar>
+              <w:top w:w="150" w:type="dxa"/>
+              <w:left w:w="0" w:type="dxa"/>
+              <w:bottom w:w="150" w:type="dxa"/>
+              <w:right w:w="240" w:type="dxa"/>
+            </w:tcMar>
+            <w:vAlign w:val="center"/>
+            <w:hideMark/>
+          </w:tcPr>
+          <w:p>
+            <w:pPr>
+              <w:spacing w:before="100" w:beforeAutospacing="1" w:after="100" w:afterAutospacing="1" w:line="240" w:lineRule="auto"/>
+              <w:rPr>
+                <w:rFonts w:ascii="Times New Roman" w:eastAsia="Times New Roman" w:hAnsi="Times New Roman" w:cs="Times New Roman"/>
+                <w:sz w:val="24"/>
+                <w:szCs w:val="24"/>
+              </w:rPr>
+            </w:pPr>
+            <w:r>
+              <w:rPr>
+                <w:rFonts w:ascii="Times New Roman" w:eastAsia="Times New Roman" w:hAnsi="Times New Roman" w:cs="Times New Roman"/>
+                <w:sz w:val="24"/>
+                <w:szCs w:val="24"/>
+              </w:rPr>
+              <w:t>#</w:t>
+            </w:r>
+          </w:p>
+        </w:tc>
+        <w:tc>
+          <w:tcPr>
+            <w:tcW w:w="0" w:type="auto"/>
+            <w:tcBorders>
+              <w:top w:val="nil"/>
+            </w:tcBorders>
+            <w:tcMar>
+              <w:top w:w="150" w:type="dxa"/>
+              <w:left w:w="240" w:type="dxa"/>
+              <w:bottom w:w="150" w:type="dxa"/>
+              <w:right w:w="240" w:type="dxa"/>
+            </w:tcMar>
+            <w:vAlign w:val="center"/>
+            <w:hideMark/>
+          </w:tcPr>
+          <w:p>
+            <w:pPr>
+              <w:spacing w:before="100" w:beforeAutospacing="1" w:after="100" w:afterAutospacing="1" w:line="240" w:lineRule="auto"/>
+              <w:rPr>
+                <w:rFonts w:ascii="Times New Roman" w:eastAsia="Times New Roman" w:hAnsi="Times New Roman" w:cs="Times New Roman"/>
+                <w:sz w:val="24"/>
+                <w:szCs w:val="24"/>
+              </w:rPr>
+            </w:pPr>
+            <w:r>
+              <w:rPr>
+                <w:rFonts w:ascii="Times New Roman" w:eastAsia="Times New Roman" w:hAnsi="Times New Roman" w:cs="Times New Roman"/>
+                <w:sz w:val="24"/>
+                <w:szCs w:val="24"/>
+              </w:rPr>
+              <w:t>Your Answer</w:t>
+            </w:r>
+          </w:p>
+        </w:tc>
+        <w:tc>
+          <w:tcPr>
+            <w:tcW w:w="0" w:type="auto"/>
+            <w:tcBorders>
+              <w:top w:val="nil"/>
+            </w:tcBorders>
+            <w:tcMar>
+              <w:top w:w="150" w:type="dxa"/>
+              <w:left w:w="240" w:type="dxa"/>
+              <w:bottom w:w="150" w:type="dxa"/>
+              <w:right w:w="240" w:type="dxa"/>
+            </w:tcMar>
+            <w:vAlign w:val="center"/>
+            <w:hideMark/>
+          </w:tcPr>
+          <w:p>
+            <w:pPr>
+              <w:spacing w:before="100" w:beforeAutospacing="1" w:after="100" w:afterAutospacing="1" w:line="240" w:lineRule="auto"/>
+              <w:rPr>
+                <w:rFonts w:ascii="Times New Roman" w:eastAsia="Times New Roman" w:hAnsi="Times New Roman" w:cs="Times New Roman"/>
+                <w:sz w:val="24"/>
+                <w:szCs w:val="24"/>
+              </w:rPr>
+            </w:pPr>
+            <w:r>
+              <w:rPr>
+                <w:rFonts w:ascii="Times New Roman" w:eastAsia="Times New Roman" w:hAnsi="Times New Roman" w:cs="Times New Roman"/>
+                <w:sz w:val="24"/>
+                <w:szCs w:val="24"/>
+              </w:rPr>
+              <w:t>Verdict</w:t>
+            </w:r>
+          </w:p>
+        </w:tc>
+      </w:tr>
+      <w:tr>
+        <w:tc>
+          <w:tcPr>
+            <w:tcW w:w="0" w:type="auto"/>
+            <w:tcMar>
+              <w:top w:w="150" w:type="dxa"/>
+              <w:left w:w="0" w:type="dxa"/>
+              <w:bottom w:w="150" w:type="dxa"/>
+              <w:right w:w="240" w:type="dxa"/>
+            </w:tcMar>
+            <w:vAlign w:val="center"/>
+            <w:hideMark/>
+          </w:tcPr>
+          <w:p>
+            <w:pPr>
+              <w:spacing w:before="100" w:beforeAutospacing="1" w:after="100" w:afterAutospacing="1" w:line="240" w:lineRule="auto"/>
+              <w:rPr>
+                <w:rFonts w:ascii="Times New Roman" w:eastAsia="Times New Roman" w:hAnsi="Times New Roman" w:cs="Times New Roman"/>
+                <w:sz w:val="24"/>
+                <w:szCs w:val="24"/>
+              </w:rPr>
+            </w:pPr>
+            <w:r>
+              <w:rPr>
+                <w:rFonts w:ascii="Times New Roman" w:eastAsia="Times New Roman" w:hAnsi="Times New Roman" w:cs="Times New Roman"/>
+                <w:sz w:val="24"/>
+                <w:szCs w:val="24"/>
+              </w:rPr>
+              <w:t>1</w:t>
+            </w:r>
+          </w:p>
+        </w:tc>
+        <w:tc>
+          <w:tcPr>
+            <w:tcW w:w="0" w:type="auto"/>
+            <w:tcMar>
+              <w:top w:w="150" w:type="dxa"/>
+              <w:left w:w="240" w:type="dxa"/>
+              <w:bottom w:w="150" w:type="dxa"/>
+              <w:right w:w="240" w:type="dxa"/>
+            </w:tcMar>
+            <w:vAlign w:val="center"/>
+            <w:hideMark/>
+          </w:tcPr>
+          <w:p>
+            <w:pPr>
+              <w:spacing w:before="100" w:beforeAutospacing="1" w:after="100" w:afterAutospacing="1" w:line="240" w:lineRule="auto"/>
+              <w:rPr>
+                <w:rFonts w:ascii="Times New Roman" w:eastAsia="Times New Roman" w:hAnsi="Times New Roman" w:cs="Times New Roman"/>
+                <w:sz w:val="24"/>
+                <w:szCs w:val="24"/>
+              </w:rPr>
+            </w:pPr>
+            <w:r>
+              <w:rPr>
+                <w:rFonts w:ascii="Times New Roman" w:eastAsia="Times New Roman" w:hAnsi="Times New Roman" w:cs="Times New Roman"/>
+                <w:sz w:val="24"/>
+                <w:szCs w:val="24"/>
+              </w:rPr>
+              <w:t>"Decodes messages to become readable/accessible"</w:t>
+            </w:r>
+          </w:p>
+        </w:tc>
+        <w:tc>
+          <w:tcPr>
+            <w:tcW w:w="0" w:type="auto"/>
+            <w:tcMar>
+              <w:top w:w="150" w:type="dxa"/>
+              <w:left w:w="240" w:type="dxa"/>
+              <w:bottom w:w="150" w:type="dxa"/>
+              <w:right w:w="0" w:type="dxa"/>
+            </w:tcMar>
+            <w:vAlign w:val="center"/>
+            <w:hideMark/>
+          </w:tcPr>
+          <w:p>
+            <w:pPr>
+              <w:spacing w:before="100" w:beforeAutospacing="1" w:after="100" w:afterAutospacing="1" w:line="240" w:lineRule="auto"/>
+              <w:rPr>
+                <w:rFonts w:ascii="Times New Roman" w:eastAsia="Times New Roman" w:hAnsi="Times New Roman" w:cs="Times New Roman"/>
+                <w:sz w:val="24"/>
+                <w:szCs w:val="24"/>
+              </w:rPr>
+            </w:pPr>
+            <w:r>
+              <w:rPr>
+                <w:rFonts w:ascii="Segoe UI Emoji" w:eastAsia="Times New Roman" w:hAnsi="Segoe UI Emoji" w:cs="Segoe UI Emoji"/>
+                <w:sz w:val="24"/>
+                <w:szCs w:val="24"/>
+              </w:rPr>
+              <w:t>✅</w:t>
+            </w:r>
+            <w:r>
+              <w:rPr>
+                <w:rFonts w:ascii="Times New Roman" w:eastAsia="Times New Roman" w:hAnsi="Times New Roman" w:cs="Times New Roman"/>
+                <w:sz w:val="24"/>
+                <w:szCs w:val="24"/>
+              </w:rPr>
+              <w:t xml:space="preserve"> Yes — Base64 decoding returns original data</w:t>
+            </w:r>
+          </w:p>
+        </w:tc>
+      </w:tr>
+      <w:tr>
+        <w:tc>
+          <w:tcPr>
+            <w:tcW w:w="0" w:type="auto"/>
+            <w:tcMar>
+              <w:top w:w="150" w:type="dxa"/>
+              <w:left w:w="0" w:type="dxa"/>
+              <w:bottom w:w="150" w:type="dxa"/>
+              <w:right w:w="240" w:type="dxa"/>
+            </w:tcMar>
+            <w:vAlign w:val="center"/>
+            <w:hideMark/>
+          </w:tcPr>
+          <w:p>
+            <w:pPr>
+              <w:spacing w:before="100" w:beforeAutospacing="1" w:after="100" w:afterAutospacing="1" w:line="240" w:lineRule="auto"/>
+              <w:rPr>
+                <w:rFonts w:ascii="Times New Roman" w:eastAsia="Times New Roman" w:hAnsi="Times New Roman" w:cs="Times New Roman"/>
+                <w:sz w:val="24"/>
+                <w:szCs w:val="24"/>
+              </w:rPr>
+            </w:pPr>
+            <w:r>
+              <w:rPr>
+                <w:rFonts w:ascii="Times New Roman" w:eastAsia="Times New Roman" w:hAnsi="Times New Roman" w:cs="Times New Roman"/>
+                <w:sz w:val="24"/>
+                <w:szCs w:val="24"/>
+              </w:rPr>
+              <w:t>2</w:t>
+            </w:r>
+          </w:p>
+        </w:tc>
+        <w:tc>
+          <w:tcPr>
+            <w:tcW w:w="0" w:type="auto"/>
+            <w:tcMar>
+              <w:top w:w="150" w:type="dxa"/>
+              <w:left w:w="240" w:type="dxa"/>
+              <w:bottom w:w="150" w:type="dxa"/>
+              <w:right w:w="240" w:type="dxa"/>
+            </w:tcMar>
+            <w:vAlign w:val="center"/>
+            <w:hideMark/>
+          </w:tcPr>
+          <w:p>
+            <w:pPr>
+              <w:spacing w:before="100" w:beforeAutospacing="1" w:after="100" w:afterAutospacing="1" w:line="240" w:lineRule="auto"/>
+              <w:rPr>
+                <w:rFonts w:ascii="Times New Roman" w:eastAsia="Times New Roman" w:hAnsi="Times New Roman" w:cs="Times New Roman"/>
+                <w:sz w:val="24"/>
+                <w:szCs w:val="24"/>
+              </w:rPr>
+            </w:pPr>
+            <w:r>
+              <w:rPr>
+                <w:rFonts w:ascii="Times New Roman" w:eastAsia="Times New Roman" w:hAnsi="Times New Roman" w:cs="Times New Roman"/>
+                <w:sz w:val="24"/>
+                <w:szCs w:val="24"/>
+              </w:rPr>
+              <w:t>tr</w:t>
+            </w:r>
+          </w:p>
+        </w:tc>
+        <w:tc>
+          <w:tcPr>
+            <w:tcW w:w="0" w:type="auto"/>
+            <w:tcMar>
+              <w:top w:w="150" w:type="dxa"/>
+              <w:left w:w="240" w:type="dxa"/>
+              <w:bottom w:w="150" w:type="dxa"/>
+              <w:right w:w="0" w:type="dxa"/>
+            </w:tcMar>
+            <w:vAlign w:val="center"/>
+            <w:hideMark/>
+          </w:tcPr>
+          <w:p>
+            <w:pPr>
+              <w:spacing w:before="100" w:beforeAutospacing="1" w:after="100" w:afterAutospacing="1" w:line="240" w:lineRule="auto"/>
+              <w:rPr>
+                <w:rFonts w:ascii="Times New Roman" w:eastAsia="Times New Roman" w:hAnsi="Times New Roman" w:cs="Times New Roman"/>
+                <w:sz w:val="24"/>
+                <w:szCs w:val="24"/>
+              </w:rPr>
+            </w:pPr>
+            <w:r>
+              <w:rPr>
+                <w:rFonts w:ascii="Segoe UI Emoji" w:eastAsia="Times New Roman" w:hAnsi="Segoe UI Emoji" w:cs="Segoe UI Emoji"/>
+                <w:sz w:val="24"/>
+                <w:szCs w:val="24"/>
+              </w:rPr>
+              <w:t>✅</w:t>
+            </w:r>
+            <w:r>
+              <w:rPr>
+                <w:rFonts w:ascii="Times New Roman" w:eastAsia="Times New Roman" w:hAnsi="Times New Roman" w:cs="Times New Roman"/>
+                <w:sz w:val="24"/>
+                <w:szCs w:val="24"/>
+              </w:rPr>
+              <w:t xml:space="preserve"> Yes — specifically tr 'A-Za-z' 'N-ZA-Mn-za-m'</w:t>
+            </w:r>
+          </w:p>
+        </w:tc>
+      </w:tr>
+      <w:tr>
+        <w:tc>
+          <w:tcPr>
+            <w:tcW w:w="0" w:type="auto"/>
+            <w:tcMar>
+              <w:top w:w="150" w:type="dxa"/>
+              <w:left w:w="0" w:type="dxa"/>
+              <w:bottom w:w="150" w:type="dxa"/>
+              <w:right w:w="240" w:type="dxa"/>
+            </w:tcMar>
+            <w:vAlign w:val="center"/>
+            <w:hideMark/>
+          </w:tcPr>
+          <w:p>
+            <w:pPr>
+              <w:spacing w:before="100" w:beforeAutospacing="1" w:after="100" w:afterAutospacing="1" w:line="240" w:lineRule="auto"/>
+              <w:rPr>
+                <w:rFonts w:ascii="Times New Roman" w:eastAsia="Times New Roman" w:hAnsi="Times New Roman" w:cs="Times New Roman"/>
+                <w:sz w:val="24"/>
+                <w:szCs w:val="24"/>
+              </w:rPr>
+            </w:pPr>
+            <w:r>
+              <w:rPr>
+                <w:rFonts w:ascii="Times New Roman" w:eastAsia="Times New Roman" w:hAnsi="Times New Roman" w:cs="Times New Roman"/>
+                <w:sz w:val="24"/>
+                <w:szCs w:val="24"/>
+              </w:rPr>
+              <w:t>3</w:t>
+            </w:r>
+          </w:p>
+        </w:tc>
+        <w:tc>
+          <w:tcPr>
+            <w:tcW w:w="0" w:type="auto"/>
+            <w:tcMar>
+              <w:top w:w="150" w:type="dxa"/>
+              <w:left w:w="240" w:type="dxa"/>
+              <w:bottom w:w="150" w:type="dxa"/>
+              <w:right w:w="240" w:type="dxa"/>
+            </w:tcMar>
+            <w:vAlign w:val="center"/>
+            <w:hideMark/>
+          </w:tcPr>
+          <w:p>
+            <w:pPr>
+              <w:spacing w:before="100" w:beforeAutospacing="1" w:after="100" w:afterAutospacing="1" w:line="240" w:lineRule="auto"/>
+              <w:rPr>
+                <w:rFonts w:ascii="Times New Roman" w:eastAsia="Times New Roman" w:hAnsi="Times New Roman" w:cs="Times New Roman"/>
+                <w:sz w:val="24"/>
+                <w:szCs w:val="24"/>
+              </w:rPr>
+            </w:pPr>
+            <w:r>
+              <w:rPr>
+                <w:rFonts w:ascii="Times New Roman" w:eastAsia="Times New Roman" w:hAnsi="Times New Roman" w:cs="Times New Roman"/>
+                <w:sz w:val="24"/>
+                <w:szCs w:val="24"/>
+              </w:rPr>
+              <w:t xml:space="preserve">"When there's </w:t>
+            </w:r>
+            <w:proofErr w:type="spellStart"/>
+            <w:r>
+              <w:rPr>
+                <w:rFonts w:ascii="Times New Roman" w:eastAsia="Times New Roman" w:hAnsi="Times New Roman" w:cs="Times New Roman"/>
+                <w:sz w:val="24"/>
+                <w:szCs w:val="24"/>
+              </w:rPr>
+              <w:t>hexfile</w:t>
+            </w:r>
+            <w:proofErr w:type="spellEnd"/>
+            <w:r>
+              <w:rPr>
+                <w:rFonts w:ascii="Times New Roman" w:eastAsia="Times New Roman" w:hAnsi="Times New Roman" w:cs="Times New Roman"/>
+                <w:sz w:val="24"/>
+                <w:szCs w:val="24"/>
+              </w:rPr>
+              <w:t xml:space="preserve"> I use it in order to access it"</w:t>
+            </w:r>
+          </w:p>
+        </w:tc>
+        <w:tc>
+          <w:tcPr>
+            <w:tcW w:w="0" w:type="auto"/>
+            <w:tcMar>
+              <w:top w:w="150" w:type="dxa"/>
+              <w:left w:w="240" w:type="dxa"/>
+              <w:bottom w:w="150" w:type="dxa"/>
+              <w:right w:w="0" w:type="dxa"/>
+            </w:tcMar>
+            <w:vAlign w:val="center"/>
+            <w:hideMark/>
+          </w:tcPr>
+          <w:p>
+            <w:pPr>
+              <w:spacing w:before="100" w:beforeAutospacing="1" w:after="100" w:afterAutospacing="1" w:line="240" w:lineRule="auto"/>
+              <w:rPr>
+                <w:rFonts w:ascii="Times New Roman" w:eastAsia="Times New Roman" w:hAnsi="Times New Roman" w:cs="Times New Roman"/>
+                <w:sz w:val="24"/>
+                <w:szCs w:val="24"/>
+              </w:rPr>
+            </w:pPr>
+            <w:r>
+              <w:rPr>
+                <w:rFonts w:ascii="Segoe UI Emoji" w:eastAsia="Times New Roman" w:hAnsi="Segoe UI Emoji" w:cs="Segoe UI Emoji"/>
+                <w:sz w:val="24"/>
+                <w:szCs w:val="24"/>
+              </w:rPr>
+              <w:t>✅</w:t>
+            </w:r>
+            <w:r>
+              <w:rPr>
+                <w:rFonts w:ascii="Times New Roman" w:eastAsia="Times New Roman" w:hAnsi="Times New Roman" w:cs="Times New Roman"/>
+                <w:sz w:val="24"/>
+                <w:szCs w:val="24"/>
+              </w:rPr>
+              <w:t xml:space="preserve"> Correct — </w:t>
+            </w:r>
+            <w:proofErr w:type="spellStart"/>
+            <w:r>
+              <w:rPr>
+                <w:rFonts w:ascii="Times New Roman" w:eastAsia="Times New Roman" w:hAnsi="Times New Roman" w:cs="Times New Roman"/>
+                <w:sz w:val="24"/>
+                <w:szCs w:val="24"/>
+              </w:rPr>
+              <w:t>xxd</w:t>
+            </w:r>
+            <w:proofErr w:type="spellEnd"/>
+            <w:r>
+              <w:rPr>
+                <w:rFonts w:ascii="Times New Roman" w:eastAsia="Times New Roman" w:hAnsi="Times New Roman" w:cs="Times New Roman"/>
+                <w:sz w:val="24"/>
+                <w:szCs w:val="24"/>
+              </w:rPr>
+              <w:t xml:space="preserve"> -r reverses </w:t>
+            </w:r>
+            <w:proofErr w:type="spellStart"/>
+            <w:r>
+              <w:rPr>
+                <w:rFonts w:ascii="Times New Roman" w:eastAsia="Times New Roman" w:hAnsi="Times New Roman" w:cs="Times New Roman"/>
+                <w:sz w:val="24"/>
+                <w:szCs w:val="24"/>
+              </w:rPr>
+              <w:t>hexdump</w:t>
+            </w:r>
+            <w:proofErr w:type="spellEnd"/>
+            <w:r>
+              <w:rPr>
+                <w:rFonts w:ascii="Times New Roman" w:eastAsia="Times New Roman" w:hAnsi="Times New Roman" w:cs="Times New Roman"/>
+                <w:sz w:val="24"/>
+                <w:szCs w:val="24"/>
+              </w:rPr>
+              <w:t xml:space="preserve"> back to binary</w:t>
+            </w:r>
+          </w:p>
+        </w:tc>
+      </w:tr>
+      <w:tr>
+        <w:tc>
+          <w:tcPr>
+            <w:tcW w:w="0" w:type="auto"/>
+            <w:tcMar>
+              <w:top w:w="150" w:type="dxa"/>
+              <w:left w:w="0" w:type="dxa"/>
+              <w:bottom w:w="150" w:type="dxa"/>
+              <w:right w:w="240" w:type="dxa"/>
+            </w:tcMar>
+            <w:vAlign w:val="center"/>
+            <w:hideMark/>
+          </w:tcPr>
+          <w:p>
+            <w:pPr>
+              <w:spacing w:before="100" w:beforeAutospacing="1" w:after="100" w:afterAutospacing="1" w:line="240" w:lineRule="auto"/>
+              <w:rPr>
+                <w:rFonts w:ascii="Times New Roman" w:eastAsia="Times New Roman" w:hAnsi="Times New Roman" w:cs="Times New Roman"/>
+                <w:sz w:val="24"/>
+                <w:szCs w:val="24"/>
+              </w:rPr>
+            </w:pPr>
+            <w:r>
+              <w:rPr>
+                <w:rFonts w:ascii="Times New Roman" w:eastAsia="Times New Roman" w:hAnsi="Times New Roman" w:cs="Times New Roman"/>
+                <w:sz w:val="24"/>
+                <w:szCs w:val="24"/>
+              </w:rPr>
+              <w:t>4</w:t>
+            </w:r>
+          </w:p>
+        </w:tc>
+        <w:tc>
+          <w:tcPr>
+            <w:tcW w:w="0" w:type="auto"/>
+            <w:tcMar>
+              <w:top w:w="150" w:type="dxa"/>
+              <w:left w:w="240" w:type="dxa"/>
+              <w:bottom w:w="150" w:type="dxa"/>
+              <w:right w:w="240" w:type="dxa"/>
+            </w:tcMar>
+            <w:vAlign w:val="center"/>
+            <w:hideMark/>
+          </w:tcPr>
+          <w:p>
+            <w:pPr>
+              <w:spacing w:before="100" w:beforeAutospacing="1" w:after="100" w:afterAutospacing="1" w:line="240" w:lineRule="auto"/>
+              <w:rPr>
+                <w:rFonts w:ascii="Times New Roman" w:eastAsia="Times New Roman" w:hAnsi="Times New Roman" w:cs="Times New Roman"/>
+                <w:sz w:val="24"/>
+                <w:szCs w:val="24"/>
+              </w:rPr>
+            </w:pPr>
+            <w:r>
+              <w:rPr>
+                <w:rFonts w:ascii="Times New Roman" w:eastAsia="Times New Roman" w:hAnsi="Times New Roman" w:cs="Times New Roman"/>
+                <w:sz w:val="24"/>
+                <w:szCs w:val="24"/>
+              </w:rPr>
+              <w:t xml:space="preserve">"I decompress the data using </w:t>
+            </w:r>
+            <w:proofErr w:type="spellStart"/>
+            <w:r>
+              <w:rPr>
+                <w:rFonts w:ascii="Times New Roman" w:eastAsia="Times New Roman" w:hAnsi="Times New Roman" w:cs="Times New Roman"/>
+                <w:sz w:val="24"/>
+                <w:szCs w:val="24"/>
+              </w:rPr>
+              <w:t>gz</w:t>
+            </w:r>
+            <w:proofErr w:type="spellEnd"/>
+            <w:r>
+              <w:rPr>
+                <w:rFonts w:ascii="Times New Roman" w:eastAsia="Times New Roman" w:hAnsi="Times New Roman" w:cs="Times New Roman"/>
+                <w:sz w:val="24"/>
+                <w:szCs w:val="24"/>
+              </w:rPr>
+              <w:t xml:space="preserve"> -d"</w:t>
+            </w:r>
+          </w:p>
+        </w:tc>
+        <w:tc>
+          <w:tcPr>
+            <w:tcW w:w="0" w:type="auto"/>
+            <w:tcMar>
+              <w:top w:w="150" w:type="dxa"/>
+              <w:left w:w="240" w:type="dxa"/>
+              <w:bottom w:w="150" w:type="dxa"/>
+              <w:right w:w="0" w:type="dxa"/>
+            </w:tcMar>
+            <w:vAlign w:val="center"/>
+            <w:hideMark/>
+          </w:tcPr>
+          <w:p>
+            <w:pPr>
+              <w:spacing w:before="100" w:beforeAutospacing="1" w:after="100" w:afterAutospacing="1" w:line="240" w:lineRule="auto"/>
+              <w:rPr>
+                <w:rFonts w:ascii="Times New Roman" w:eastAsia="Times New Roman" w:hAnsi="Times New Roman" w:cs="Times New Roman"/>
+                <w:sz w:val="24"/>
+                <w:szCs w:val="24"/>
+              </w:rPr>
+            </w:pPr>
+            <w:r>
+              <w:rPr>
+                <w:rFonts w:ascii="Segoe UI Emoji" w:eastAsia="Times New Roman" w:hAnsi="Segoe UI Emoji" w:cs="Segoe UI Emoji"/>
+                <w:sz w:val="24"/>
+                <w:szCs w:val="24"/>
+              </w:rPr>
+              <w:t>✅</w:t>
+            </w:r>
+            <w:r>
+              <w:rPr>
+                <w:rFonts w:ascii="Times New Roman" w:eastAsia="Times New Roman" w:hAnsi="Times New Roman" w:cs="Times New Roman"/>
+                <w:sz w:val="24"/>
+                <w:szCs w:val="24"/>
+              </w:rPr>
+              <w:t xml:space="preserve"> Yes — </w:t>
+            </w:r>
+            <w:proofErr w:type="spellStart"/>
+            <w:r>
+              <w:rPr>
+                <w:rFonts w:ascii="Times New Roman" w:eastAsia="Times New Roman" w:hAnsi="Times New Roman" w:cs="Times New Roman"/>
+                <w:sz w:val="24"/>
+                <w:szCs w:val="24"/>
+              </w:rPr>
+              <w:t>gzip</w:t>
+            </w:r>
+            <w:proofErr w:type="spellEnd"/>
+            <w:r>
+              <w:rPr>
+                <w:rFonts w:ascii="Times New Roman" w:eastAsia="Times New Roman" w:hAnsi="Times New Roman" w:cs="Times New Roman"/>
+                <w:sz w:val="24"/>
+                <w:szCs w:val="24"/>
+              </w:rPr>
+              <w:t xml:space="preserve"> -d (or </w:t>
+            </w:r>
+            <w:proofErr w:type="spellStart"/>
+            <w:r>
+              <w:rPr>
+                <w:rFonts w:ascii="Times New Roman" w:eastAsia="Times New Roman" w:hAnsi="Times New Roman" w:cs="Times New Roman"/>
+                <w:sz w:val="24"/>
+                <w:szCs w:val="24"/>
+              </w:rPr>
+              <w:t>gz</w:t>
+            </w:r>
+            <w:proofErr w:type="spellEnd"/>
+            <w:r>
+              <w:rPr>
+                <w:rFonts w:ascii="Times New Roman" w:eastAsia="Times New Roman" w:hAnsi="Times New Roman" w:cs="Times New Roman"/>
+                <w:sz w:val="24"/>
+                <w:szCs w:val="24"/>
+              </w:rPr>
+              <w:t xml:space="preserve"> -d is understood)</w:t>
+            </w:r>
+          </w:p>
+        </w:tc>
+      </w:tr>
+      <w:tr>
+        <w:tc>
+          <w:tcPr>
+            <w:tcW w:w="0" w:type="auto"/>
+            <w:tcMar>
+              <w:top w:w="150" w:type="dxa"/>
+              <w:left w:w="0" w:type="dxa"/>
+              <w:bottom w:w="150" w:type="dxa"/>
+              <w:right w:w="240" w:type="dxa"/>
+            </w:tcMar>
+            <w:vAlign w:val="center"/>
+            <w:hideMark/>
+          </w:tcPr>
+          <w:p>
+            <w:pPr>
+              <w:spacing w:before="100" w:beforeAutospacing="1" w:after="100" w:afterAutospacing="1" w:line="240" w:lineRule="auto"/>
+              <w:rPr>
+                <w:rFonts w:ascii="Times New Roman" w:eastAsia="Times New Roman" w:hAnsi="Times New Roman" w:cs="Times New Roman"/>
+                <w:sz w:val="24"/>
+                <w:szCs w:val="24"/>
+              </w:rPr>
+            </w:pPr>
+            <w:r>
+              <w:rPr>
+                <w:rFonts w:ascii="Times New Roman" w:eastAsia="Times New Roman" w:hAnsi="Times New Roman" w:cs="Times New Roman"/>
+                <w:sz w:val="24"/>
+                <w:szCs w:val="24"/>
+              </w:rPr>
+              <w:t>5</w:t>
+            </w:r>
+          </w:p>
+        </w:tc>
+        <w:tc>
+          <w:tcPr>
+            <w:tcW w:w="0" w:type="auto"/>
+            <w:tcMar>
+              <w:top w:w="150" w:type="dxa"/>
+              <w:left w:w="240" w:type="dxa"/>
+              <w:bottom w:w="150" w:type="dxa"/>
+              <w:right w:w="240" w:type="dxa"/>
+            </w:tcMar>
+            <w:vAlign w:val="center"/>
+            <w:hideMark/>
+          </w:tcPr>
+          <w:p>
+            <w:pPr>
+              <w:spacing w:before="100" w:beforeAutospacing="1" w:after="100" w:afterAutospacing="1" w:line="240" w:lineRule="auto"/>
+              <w:rPr>
+                <w:rFonts w:ascii="Times New Roman" w:eastAsia="Times New Roman" w:hAnsi="Times New Roman" w:cs="Times New Roman"/>
+                <w:sz w:val="24"/>
+                <w:szCs w:val="24"/>
+              </w:rPr>
+            </w:pPr>
+            <w:r>
+              <w:rPr>
+                <w:rFonts w:ascii="Times New Roman" w:eastAsia="Times New Roman" w:hAnsi="Times New Roman" w:cs="Times New Roman"/>
+                <w:sz w:val="24"/>
+                <w:szCs w:val="24"/>
+              </w:rPr>
+              <w:t>"Connect to a remote server using a passkey"</w:t>
+            </w:r>
+          </w:p>
+        </w:tc>
+        <w:tc>
+          <w:tcPr>
+            <w:tcW w:w="0" w:type="auto"/>
+            <w:tcMar>
+              <w:top w:w="150" w:type="dxa"/>
+              <w:left w:w="240" w:type="dxa"/>
+              <w:bottom w:w="150" w:type="dxa"/>
+              <w:right w:w="0" w:type="dxa"/>
+            </w:tcMar>
+            <w:vAlign w:val="center"/>
+            <w:hideMark/>
+          </w:tcPr>
+          <w:p>
+            <w:pPr>
+              <w:spacing w:before="100" w:beforeAutospacing="1" w:after="100" w:afterAutospacing="1" w:line="240" w:lineRule="auto"/>
+              <w:rPr>
+                <w:rFonts w:ascii="Times New Roman" w:eastAsia="Times New Roman" w:hAnsi="Times New Roman" w:cs="Times New Roman"/>
+                <w:sz w:val="24"/>
+                <w:szCs w:val="24"/>
+              </w:rPr>
+            </w:pPr>
+            <w:r>
+              <w:rPr>
+                <w:rFonts w:ascii="Segoe UI Emoji" w:eastAsia="Times New Roman" w:hAnsi="Segoe UI Emoji" w:cs="Segoe UI Emoji"/>
+                <w:sz w:val="24"/>
+                <w:szCs w:val="24"/>
+              </w:rPr>
+              <w:t>✅</w:t>
+            </w:r>
+            <w:r>
+              <w:rPr>
+                <w:rFonts w:ascii="Times New Roman" w:eastAsia="Times New Roman" w:hAnsi="Times New Roman" w:cs="Times New Roman"/>
+                <w:sz w:val="24"/>
+                <w:szCs w:val="24"/>
+              </w:rPr>
+              <w:t xml:space="preserve"> Yes — -</w:t>
+            </w:r>
+            <w:proofErr w:type="spellStart"/>
+            <w:r>
+              <w:rPr>
+                <w:rFonts w:ascii="Times New Roman" w:eastAsia="Times New Roman" w:hAnsi="Times New Roman" w:cs="Times New Roman"/>
+                <w:sz w:val="24"/>
+                <w:szCs w:val="24"/>
+              </w:rPr>
+              <w:t>i</w:t>
+            </w:r>
+            <w:proofErr w:type="spellEnd"/>
+            <w:r>
+              <w:rPr>
+                <w:rFonts w:ascii="Times New Roman" w:eastAsia="Times New Roman" w:hAnsi="Times New Roman" w:cs="Times New Roman"/>
+                <w:sz w:val="24"/>
+                <w:szCs w:val="24"/>
+              </w:rPr>
+              <w:t> tells SSH to use a key file</w:t>
+            </w:r>
+          </w:p>
+        </w:tc>
+      </w:tr>
+      <w:tr>
+        <w:tc>
+          <w:tcPr>
+            <w:tcW w:w="0" w:type="auto"/>
+            <w:tcMar>
+              <w:top w:w="150" w:type="dxa"/>
+              <w:left w:w="0" w:type="dxa"/>
+              <w:bottom w:w="150" w:type="dxa"/>
+              <w:right w:w="240" w:type="dxa"/>
+            </w:tcMar>
+            <w:vAlign w:val="center"/>
+            <w:hideMark/>
+          </w:tcPr>
+          <w:p>
+            <w:pPr>
+              <w:spacing w:before="100" w:beforeAutospacing="1" w:after="100" w:afterAutospacing="1" w:line="240" w:lineRule="auto"/>
+              <w:rPr>
+                <w:rFonts w:ascii="Times New Roman" w:eastAsia="Times New Roman" w:hAnsi="Times New Roman" w:cs="Times New Roman"/>
+                <w:sz w:val="24"/>
+                <w:szCs w:val="24"/>
+              </w:rPr>
+            </w:pPr>
+            <w:r>
+              <w:rPr>
+                <w:rFonts w:ascii="Times New Roman" w:eastAsia="Times New Roman" w:hAnsi="Times New Roman" w:cs="Times New Roman"/>
+                <w:sz w:val="24"/>
+                <w:szCs w:val="24"/>
+              </w:rPr>
+              <w:t>6</w:t>
+            </w:r>
+          </w:p>
+        </w:tc>
+        <w:tc>
+          <w:tcPr>
+            <w:tcW w:w="0" w:type="auto"/>
+            <w:tcMar>
+              <w:top w:w="150" w:type="dxa"/>
+              <w:left w:w="240" w:type="dxa"/>
+              <w:bottom w:w="150" w:type="dxa"/>
+              <w:right w:w="240" w:type="dxa"/>
+            </w:tcMar>
+            <w:vAlign w:val="center"/>
+            <w:hideMark/>
+          </w:tcPr>
+          <w:p>
+            <w:pPr>
+              <w:spacing w:before="100" w:beforeAutospacing="1" w:after="100" w:afterAutospacing="1" w:line="240" w:lineRule="auto"/>
+              <w:rPr>
+                <w:rFonts w:ascii="Times New Roman" w:eastAsia="Times New Roman" w:hAnsi="Times New Roman" w:cs="Times New Roman"/>
+                <w:sz w:val="24"/>
+                <w:szCs w:val="24"/>
+              </w:rPr>
+            </w:pPr>
+            <w:r>
+              <w:rPr>
+                <w:rFonts w:ascii="Times New Roman" w:eastAsia="Times New Roman" w:hAnsi="Times New Roman" w:cs="Times New Roman"/>
+                <w:sz w:val="24"/>
+                <w:szCs w:val="24"/>
+              </w:rPr>
+              <w:t>"to connect to different ports and listen in"</w:t>
+            </w:r>
+          </w:p>
+        </w:tc>
+        <w:tc>
+          <w:tcPr>
+            <w:tcW w:w="0" w:type="auto"/>
+            <w:tcMar>
+              <w:top w:w="150" w:type="dxa"/>
+              <w:left w:w="240" w:type="dxa"/>
+              <w:bottom w:w="150" w:type="dxa"/>
+              <w:right w:w="0" w:type="dxa"/>
+            </w:tcMar>
+            <w:vAlign w:val="center"/>
+            <w:hideMark/>
+          </w:tcPr>
+          <w:p>
+            <w:pPr>
+              <w:spacing w:before="100" w:beforeAutospacing="1" w:after="100" w:afterAutospacing="1" w:line="240" w:lineRule="auto"/>
+              <w:rPr>
+                <w:rFonts w:ascii="Times New Roman" w:eastAsia="Times New Roman" w:hAnsi="Times New Roman" w:cs="Times New Roman"/>
+                <w:sz w:val="24"/>
+                <w:szCs w:val="24"/>
+              </w:rPr>
+            </w:pPr>
+            <w:r>
+              <w:rPr>
+                <w:rFonts w:ascii="Segoe UI Emoji" w:eastAsia="Times New Roman" w:hAnsi="Segoe UI Emoji" w:cs="Segoe UI Emoji"/>
+                <w:sz w:val="24"/>
+                <w:szCs w:val="24"/>
+              </w:rPr>
+              <w:t>✅</w:t>
+            </w:r>
+            <w:r>
+              <w:rPr>
+                <w:rFonts w:ascii="Times New Roman" w:eastAsia="Times New Roman" w:hAnsi="Times New Roman" w:cs="Times New Roman"/>
+                <w:sz w:val="24"/>
+                <w:szCs w:val="24"/>
+              </w:rPr>
+              <w:t xml:space="preserve"> Yes — </w:t>
+            </w:r>
+            <w:proofErr w:type="spellStart"/>
+            <w:r>
+              <w:rPr>
+                <w:rFonts w:ascii="Times New Roman" w:eastAsia="Times New Roman" w:hAnsi="Times New Roman" w:cs="Times New Roman"/>
+                <w:sz w:val="24"/>
+                <w:szCs w:val="24"/>
+              </w:rPr>
+              <w:t>netcat</w:t>
+            </w:r>
+            <w:proofErr w:type="spellEnd"/>
+            <w:r>
+              <w:rPr>
+                <w:rFonts w:ascii="Times New Roman" w:eastAsia="Times New Roman" w:hAnsi="Times New Roman" w:cs="Times New Roman"/>
+                <w:sz w:val="24"/>
+                <w:szCs w:val="24"/>
+              </w:rPr>
+              <w:t xml:space="preserve"> is for network reading/writing, port testing, etc.</w:t>
+            </w:r>
+          </w:p>
+        </w:tc>
+      </w:tr>
+      <w:tr>
+        <w:tc>
+          <w:tcPr>
+            <w:tcW w:w="0" w:type="auto"/>
+            <w:tcMar>
+              <w:top w:w="150" w:type="dxa"/>
+              <w:left w:w="0" w:type="dxa"/>
+              <w:bottom w:w="150" w:type="dxa"/>
+              <w:right w:w="240" w:type="dxa"/>
+            </w:tcMar>
+            <w:vAlign w:val="center"/>
+            <w:hideMark/>
+          </w:tcPr>
+          <w:p>
+            <w:pPr>
+              <w:spacing w:before="100" w:beforeAutospacing="1" w:after="100" w:afterAutospacing="1" w:line="240" w:lineRule="auto"/>
+              <w:rPr>
+                <w:rFonts w:ascii="Times New Roman" w:eastAsia="Times New Roman" w:hAnsi="Times New Roman" w:cs="Times New Roman"/>
+                <w:sz w:val="24"/>
+                <w:szCs w:val="24"/>
+              </w:rPr>
+            </w:pPr>
+            <w:r>
+              <w:rPr>
+                <w:rFonts w:ascii="Times New Roman" w:eastAsia="Times New Roman" w:hAnsi="Times New Roman" w:cs="Times New Roman"/>
+                <w:sz w:val="24"/>
+                <w:szCs w:val="24"/>
+              </w:rPr>
+              <w:t>7</w:t>
+            </w:r>
+          </w:p>
+        </w:tc>
+        <w:tc>
+          <w:tcPr>
+            <w:tcW w:w="0" w:type="auto"/>
+            <w:tcMar>
+              <w:top w:w="150" w:type="dxa"/>
+              <w:left w:w="240" w:type="dxa"/>
+              <w:bottom w:w="150" w:type="dxa"/>
+              <w:right w:w="240" w:type="dxa"/>
+            </w:tcMar>
+            <w:vAlign w:val="center"/>
+            <w:hideMark/>
+          </w:tcPr>
+          <w:p>
+            <w:pPr>
+              <w:spacing w:before="100" w:beforeAutospacing="1" w:after="100" w:afterAutospacing="1" w:line="240" w:lineRule="auto"/>
+              <w:rPr>
+                <w:rFonts w:ascii="Times New Roman" w:eastAsia="Times New Roman" w:hAnsi="Times New Roman" w:cs="Times New Roman"/>
+                <w:sz w:val="24"/>
+                <w:szCs w:val="24"/>
+              </w:rPr>
+            </w:pPr>
+            <w:r>
+              <w:rPr>
+                <w:rFonts w:ascii="Times New Roman" w:eastAsia="Times New Roman" w:hAnsi="Times New Roman" w:cs="Times New Roman"/>
+                <w:sz w:val="24"/>
+                <w:szCs w:val="24"/>
+              </w:rPr>
+              <w:t>"To change file's permission to only me who can change/read it so that bandit server would accept it"</w:t>
+            </w:r>
+          </w:p>
+        </w:tc>
+        <w:tc>
+          <w:tcPr>
+            <w:tcW w:w="0" w:type="auto"/>
+            <w:tcMar>
+              <w:top w:w="150" w:type="dxa"/>
+              <w:left w:w="240" w:type="dxa"/>
+              <w:bottom w:w="150" w:type="dxa"/>
+              <w:right w:w="0" w:type="dxa"/>
+            </w:tcMar>
+            <w:vAlign w:val="center"/>
+            <w:hideMark/>
+          </w:tcPr>
+          <w:p>
+            <w:pPr>
+              <w:spacing w:before="100" w:beforeAutospacing="1" w:after="100" w:afterAutospacing="1" w:line="240" w:lineRule="auto"/>
+              <w:rPr>
+                <w:rFonts w:ascii="Times New Roman" w:eastAsia="Times New Roman" w:hAnsi="Times New Roman" w:cs="Times New Roman"/>
+                <w:sz w:val="24"/>
+                <w:szCs w:val="24"/>
+              </w:rPr>
+            </w:pPr>
+            <w:r>
+              <w:rPr>
+                <w:rFonts w:ascii="Segoe UI Emoji" w:eastAsia="Times New Roman" w:hAnsi="Segoe UI Emoji" w:cs="Segoe UI Emoji"/>
+                <w:sz w:val="24"/>
+                <w:szCs w:val="24"/>
+              </w:rPr>
+              <w:t>✅</w:t>
+            </w:r>
+            <w:r>
+              <w:rPr>
+                <w:rFonts w:ascii="Times New Roman" w:eastAsia="Times New Roman" w:hAnsi="Times New Roman" w:cs="Times New Roman"/>
+                <w:sz w:val="24"/>
+                <w:szCs w:val="24"/>
+              </w:rPr>
+              <w:t xml:space="preserve"> Exactly right — SSH refuses keys that are too open</w:t>
+            </w:r>
+          </w:p>
+        </w:tc>
+      </w:tr>
+      <w:tr>
+        <w:tc>
+          <w:tcPr>
+            <w:tcW w:w="0" w:type="auto"/>
+            <w:tcMar>
+              <w:top w:w="150" w:type="dxa"/>
+              <w:left w:w="0" w:type="dxa"/>
+              <w:bottom w:w="150" w:type="dxa"/>
+              <w:right w:w="240" w:type="dxa"/>
+            </w:tcMar>
+            <w:vAlign w:val="center"/>
+            <w:hideMark/>
+          </w:tcPr>
+          <w:p>
+            <w:pPr>
+              <w:spacing w:before="100" w:beforeAutospacing="1" w:after="100" w:afterAutospacing="1" w:line="240" w:lineRule="auto"/>
+              <w:rPr>
+                <w:rFonts w:ascii="Times New Roman" w:eastAsia="Times New Roman" w:hAnsi="Times New Roman" w:cs="Times New Roman"/>
+                <w:sz w:val="24"/>
+                <w:szCs w:val="24"/>
+              </w:rPr>
+            </w:pPr>
+            <w:r>
+              <w:rPr>
+                <w:rFonts w:ascii="Times New Roman" w:eastAsia="Times New Roman" w:hAnsi="Times New Roman" w:cs="Times New Roman"/>
+                <w:sz w:val="24"/>
+                <w:szCs w:val="24"/>
+              </w:rPr>
+              <w:t>8</w:t>
+            </w:r>
+          </w:p>
+        </w:tc>
+        <w:tc>
+          <w:tcPr>
+            <w:tcW w:w="0" w:type="auto"/>
+            <w:tcMar>
+              <w:top w:w="150" w:type="dxa"/>
+              <w:left w:w="240" w:type="dxa"/>
+              <w:bottom w:w="150" w:type="dxa"/>
+              <w:right w:w="240" w:type="dxa"/>
+            </w:tcMar>
+            <w:vAlign w:val="center"/>
+            <w:hideMark/>
+          </w:tcPr>
+          <w:p>
+            <w:pPr>
+              <w:spacing w:before="100" w:beforeAutospacing="1" w:after="100" w:afterAutospacing="1" w:line="240" w:lineRule="auto"/>
+              <w:rPr>
+                <w:rFonts w:ascii="Times New Roman" w:eastAsia="Times New Roman" w:hAnsi="Times New Roman" w:cs="Times New Roman"/>
+                <w:sz w:val="24"/>
+                <w:szCs w:val="24"/>
+              </w:rPr>
+            </w:pPr>
+            <w:r>
+              <w:rPr>
+                <w:rFonts w:ascii="Times New Roman" w:eastAsia="Times New Roman" w:hAnsi="Times New Roman" w:cs="Times New Roman"/>
+                <w:sz w:val="24"/>
+                <w:szCs w:val="24"/>
+              </w:rPr>
+              <w:t>"false"</w:t>
+            </w:r>
+          </w:p>
+        </w:tc>
+        <w:tc>
+          <w:tcPr>
+            <w:tcW w:w="0" w:type="auto"/>
+            <w:tcMar>
+              <w:top w:w="150" w:type="dxa"/>
+              <w:left w:w="240" w:type="dxa"/>
+              <w:bottom w:w="150" w:type="dxa"/>
+              <w:right w:w="0" w:type="dxa"/>
+            </w:tcMar>
+            <w:vAlign w:val="center"/>
+            <w:hideMark/>
+          </w:tcPr>
+          <w:p>
+            <w:pPr>
+              <w:spacing w:before="100" w:beforeAutospacing="1" w:after="100" w:afterAutospacing="1" w:line="240" w:lineRule="auto"/>
+              <w:rPr>
+                <w:rFonts w:ascii="Times New Roman" w:eastAsia="Times New Roman" w:hAnsi="Times New Roman" w:cs="Times New Roman"/>
+                <w:sz w:val="24"/>
+                <w:szCs w:val="24"/>
+              </w:rPr>
+            </w:pPr>
+            <w:r>
+              <w:rPr>
+                <w:rFonts w:ascii="Segoe UI Emoji" w:eastAsia="Times New Roman" w:hAnsi="Segoe UI Emoji" w:cs="Segoe UI Emoji"/>
+                <w:sz w:val="24"/>
+                <w:szCs w:val="24"/>
+              </w:rPr>
+              <w:t>✅</w:t>
+            </w:r>
+            <w:r>
+              <w:rPr>
+                <w:rFonts w:ascii="Times New Roman" w:eastAsia="Times New Roman" w:hAnsi="Times New Roman" w:cs="Times New Roman"/>
+                <w:sz w:val="24"/>
+                <w:szCs w:val="24"/>
+              </w:rPr>
+              <w:t xml:space="preserve"> Correct — Base64 is encoding, not encryption</w:t>
+            </w:r>
+          </w:p>
+        </w:tc>
+      </w:tr>
+      <w:tr>
+        <w:tc>
+          <w:tcPr>
+            <w:tcW w:w="0" w:type="auto"/>
+            <w:tcMar>
+              <w:top w:w="150" w:type="dxa"/>
+              <w:left w:w="0" w:type="dxa"/>
+              <w:bottom w:w="150" w:type="dxa"/>
+              <w:right w:w="240" w:type="dxa"/>
+            </w:tcMar>
+            <w:vAlign w:val="center"/>
+            <w:hideMark/>
+          </w:tcPr>
+          <w:p>
+            <w:pPr>
+              <w:spacing w:before="100" w:beforeAutospacing="1" w:after="100" w:afterAutospacing="1" w:line="240" w:lineRule="auto"/>
+              <w:rPr>
+                <w:rFonts w:ascii="Times New Roman" w:eastAsia="Times New Roman" w:hAnsi="Times New Roman" w:cs="Times New Roman"/>
+                <w:sz w:val="24"/>
+                <w:szCs w:val="24"/>
+              </w:rPr>
+            </w:pPr>
+            <w:r>
+              <w:rPr>
+                <w:rFonts w:ascii="Times New Roman" w:eastAsia="Times New Roman" w:hAnsi="Times New Roman" w:cs="Times New Roman"/>
+                <w:sz w:val="24"/>
+                <w:szCs w:val="24"/>
+              </w:rPr>
+              <w:t>9</w:t>
+            </w:r>
+          </w:p>
+        </w:tc>
+        <w:tc>
+          <w:tcPr>
+            <w:tcW w:w="0" w:type="auto"/>
+            <w:tcMar>
+              <w:top w:w="150" w:type="dxa"/>
+              <w:left w:w="240" w:type="dxa"/>
+              <w:bottom w:w="150" w:type="dxa"/>
+              <w:right w:w="240" w:type="dxa"/>
+            </w:tcMar>
+            <w:vAlign w:val="center"/>
+            <w:hideMark/>
+          </w:tcPr>
+          <w:p>
+            <w:pPr>
+              <w:spacing w:before="100" w:beforeAutospacing="1" w:after="100" w:afterAutospacing="1" w:line="240" w:lineRule="auto"/>
+              <w:rPr>
+                <w:rFonts w:ascii="Times New Roman" w:eastAsia="Times New Roman" w:hAnsi="Times New Roman" w:cs="Times New Roman"/>
+                <w:sz w:val="24"/>
+                <w:szCs w:val="24"/>
+              </w:rPr>
+            </w:pPr>
+            <w:r>
+              <w:rPr>
+                <w:rFonts w:ascii="Times New Roman" w:eastAsia="Times New Roman" w:hAnsi="Times New Roman" w:cs="Times New Roman"/>
+                <w:sz w:val="24"/>
+                <w:szCs w:val="24"/>
+              </w:rPr>
+              <w:t>"so that it can be removed automatically later after using it and be done with it"</w:t>
+            </w:r>
+          </w:p>
+        </w:tc>
+        <w:tc>
+          <w:tcPr>
+            <w:tcW w:w="0" w:type="auto"/>
+            <w:tcMar>
+              <w:top w:w="150" w:type="dxa"/>
+              <w:left w:w="240" w:type="dxa"/>
+              <w:bottom w:w="150" w:type="dxa"/>
+              <w:right w:w="0" w:type="dxa"/>
+            </w:tcMar>
+            <w:vAlign w:val="center"/>
+            <w:hideMark/>
+          </w:tcPr>
+          <w:p>
+            <w:pPr>
+              <w:spacing w:before="100" w:beforeAutospacing="1" w:after="100" w:afterAutospacing="1" w:line="240" w:lineRule="auto"/>
+              <w:rPr>
+                <w:rFonts w:ascii="Times New Roman" w:eastAsia="Times New Roman" w:hAnsi="Times New Roman" w:cs="Times New Roman"/>
+                <w:sz w:val="24"/>
+                <w:szCs w:val="24"/>
+              </w:rPr>
+            </w:pPr>
+            <w:r>
+              <w:rPr>
+                <w:rFonts w:ascii="Segoe UI Emoji" w:eastAsia="Times New Roman" w:hAnsi="Segoe UI Emoji" w:cs="Segoe UI Emoji"/>
+                <w:sz w:val="24"/>
+                <w:szCs w:val="24"/>
+              </w:rPr>
+              <w:t>✅</w:t>
+            </w:r>
+            <w:r>
+              <w:rPr>
+                <w:rFonts w:ascii="Times New Roman" w:eastAsia="Times New Roman" w:hAnsi="Times New Roman" w:cs="Times New Roman"/>
+                <w:sz w:val="24"/>
+                <w:szCs w:val="24"/>
+              </w:rPr>
+              <w:t xml:space="preserve"> Yes — temporary directories are cleaned up automatically or manually</w:t>
+            </w:r>
+          </w:p>
+        </w:tc>
+      </w:tr>
+      <w:tr>
+        <w:tc>
+          <w:tcPr>
+            <w:tcW w:w="0" w:type="auto"/>
+            <w:tcMar>
+              <w:top w:w="150" w:type="dxa"/>
+              <w:left w:w="0" w:type="dxa"/>
+              <w:bottom w:w="150" w:type="dxa"/>
+              <w:right w:w="240" w:type="dxa"/>
+            </w:tcMar>
+            <w:vAlign w:val="center"/>
+            <w:hideMark/>
+          </w:tcPr>
+          <w:p>
+            <w:pPr>
+              <w:spacing w:before="100" w:beforeAutospacing="1" w:after="100" w:afterAutospacing="1" w:line="240" w:lineRule="auto"/>
+              <w:rPr>
+                <w:rFonts w:ascii="Times New Roman" w:eastAsia="Times New Roman" w:hAnsi="Times New Roman" w:cs="Times New Roman"/>
+                <w:sz w:val="24"/>
+                <w:szCs w:val="24"/>
+              </w:rPr>
+            </w:pPr>
+            <w:r>
+              <w:rPr>
+                <w:rFonts w:ascii="Times New Roman" w:eastAsia="Times New Roman" w:hAnsi="Times New Roman" w:cs="Times New Roman"/>
+                <w:sz w:val="24"/>
+                <w:szCs w:val="24"/>
+              </w:rPr>
+              <w:t>10</w:t>
+            </w:r>
+          </w:p>
+        </w:tc>
+        <w:tc>
+          <w:tcPr>
+            <w:tcW w:w="0" w:type="auto"/>
+            <w:tcMar>
+              <w:top w:w="150" w:type="dxa"/>
+              <w:left w:w="240" w:type="dxa"/>
+              <w:bottom w:w="150" w:type="dxa"/>
+              <w:right w:w="240" w:type="dxa"/>
+            </w:tcMar>
+            <w:vAlign w:val="center"/>
+            <w:hideMark/>
+          </w:tcPr>
+          <w:p>
+            <w:pPr>
+              <w:spacing w:before="100" w:beforeAutospacing="1" w:after="100" w:afterAutospacing="1" w:line="240" w:lineRule="auto"/>
+              <w:rPr>
+                <w:rFonts w:ascii="Times New Roman" w:eastAsia="Times New Roman" w:hAnsi="Times New Roman" w:cs="Times New Roman"/>
+                <w:sz w:val="24"/>
+                <w:szCs w:val="24"/>
+              </w:rPr>
+            </w:pPr>
+            <w:r>
+              <w:rPr>
+                <w:rFonts w:ascii="Times New Roman" w:eastAsia="Times New Roman" w:hAnsi="Times New Roman" w:cs="Times New Roman"/>
+                <w:sz w:val="24"/>
+                <w:szCs w:val="24"/>
+              </w:rPr>
+              <w:t>"Filtering and decoding, when filtering for useful data, and when decoding important data"</w:t>
+            </w:r>
+          </w:p>
+        </w:tc>
+        <w:tc>
+          <w:tcPr>
+            <w:tcW w:w="0" w:type="auto"/>
+            <w:tcMar>
+              <w:top w:w="150" w:type="dxa"/>
+              <w:left w:w="240" w:type="dxa"/>
+              <w:bottom w:w="150" w:type="dxa"/>
+              <w:right w:w="0" w:type="dxa"/>
+            </w:tcMar>
+            <w:vAlign w:val="center"/>
+            <w:hideMark/>
+          </w:tcPr>
+          <w:p>
+            <w:pPr>
+              <w:spacing w:before="100" w:beforeAutospacing="1" w:after="100" w:afterAutospacing="1" w:line="240" w:lineRule="auto"/>
+              <w:rPr>
+                <w:rFonts w:ascii="Times New Roman" w:eastAsia="Times New Roman" w:hAnsi="Times New Roman" w:cs="Times New Roman"/>
+                <w:sz w:val="24"/>
+                <w:szCs w:val="24"/>
+              </w:rPr>
+            </w:pPr>
+            <w:r>
+              <w:rPr>
+                <w:rFonts w:ascii="Segoe UI Emoji" w:eastAsia="Times New Roman" w:hAnsi="Segoe UI Emoji" w:cs="Segoe UI Emoji"/>
+                <w:sz w:val="24"/>
+                <w:szCs w:val="24"/>
+              </w:rPr>
+              <w:t>✅</w:t>
+            </w:r>
+            <w:r>
+              <w:rPr>
+                <w:rFonts w:ascii="Times New Roman" w:eastAsia="Times New Roman" w:hAnsi="Times New Roman" w:cs="Times New Roman"/>
+                <w:sz w:val="24"/>
+                <w:szCs w:val="24"/>
+              </w:rPr>
+              <w:t xml:space="preserve"> Yes — strings </w:t>
+            </w:r>
+            <w:proofErr w:type="gramStart"/>
+            <w:r>
+              <w:rPr>
+                <w:rFonts w:ascii="Times New Roman" w:eastAsia="Times New Roman" w:hAnsi="Times New Roman" w:cs="Times New Roman"/>
+                <w:sz w:val="24"/>
+                <w:szCs w:val="24"/>
+              </w:rPr>
+              <w:t>extracts</w:t>
+            </w:r>
+            <w:proofErr w:type="gramEnd"/>
+            <w:r>
+              <w:rPr>
+                <w:rFonts w:ascii="Times New Roman" w:eastAsia="Times New Roman" w:hAnsi="Times New Roman" w:cs="Times New Roman"/>
+                <w:sz w:val="24"/>
+                <w:szCs w:val="24"/>
+              </w:rPr>
+              <w:t xml:space="preserve"> readable text; base64 decodes API tokens, malware payloads, etc.</w:t>
+            </w:r>
+          </w:p>
+        </w:tc>
+      </w:tr>
+    </w:tbl>
+    <w:p>
+      <w:pPr>
         <w:spacing w:before="100" w:beforeAutospacing="1" w:after="100" w:afterAutospacing="1" w:line="240" w:lineRule="auto"/>
         <w:rPr>
           <w:rFonts w:ascii="Times New Roman" w:eastAsia="Times New Roman" w:hAnsi="Times New Roman" w:cs="Times New Roman"/>
@@ -884,6 +2990,163 @@
     </w:sectPr>
   </w:body>
 </w:document>
+</file>
+
+<file path=word/numbering.xml><?xml version="1.0" encoding="utf-8"?>
+<w:numbering xmlns:wpc="http://schemas.microsoft.com/office/word/2010/wordprocessingCanvas" xmlns:cx="http://schemas.microsoft.com/office/drawing/2014/chartex" xmlns:cx1="http://schemas.microsoft.com/office/drawing/2015/9/8/chartex" xmlns:cx2="http://schemas.microsoft.com/office/drawing/2015/10/21/chartex" xmlns:cx3="http://schemas.microsoft.com/office/drawing/2016/5/9/chartex" xmlns:cx4="http://schemas.microsoft.com/office/drawing/2016/5/10/chartex" xmlns:cx5="http://schemas.microsoft.com/office/drawing/2016/5/11/chartex" xmlns:cx6="http://schemas.microsoft.com/office/drawing/2016/5/12/chartex" xmlns:cx7="http://schemas.microsoft.com/office/drawing/2016/5/13/chartex" xmlns:cx8="http://schemas.microsoft.com/office/drawing/2016/5/14/chartex" xmlns:mc="http://schemas.openxmlformats.org/markup-compatibility/2006" xmlns:aink="http://schemas.microsoft.com/office/drawing/2016/ink" xmlns:am3d="http://schemas.microsoft.com/office/drawing/2017/model3d" xmlns:o="urn:schemas-microsoft-com:office:office" xmlns:r="http://schemas.openxmlformats.org/officeDocument/2006/relationships" xmlns:m="http://schemas.openxmlformats.org/officeDocument/2006/math" xmlns:v="urn:schemas-microsoft-com:vml" xmlns:wp14="http://schemas.microsoft.com/office/word/2010/wordprocessingDrawing" xmlns:wp="http://schemas.openxmlformats.org/drawingml/2006/wordprocessingDrawing" xmlns:w10="urn:schemas-microsoft-com:office:word" xmlns:w="http://schemas.openxmlformats.org/wordprocessingml/2006/main" xmlns:w14="http://schemas.microsoft.com/office/word/2010/wordml" xmlns:w15="http://schemas.microsoft.com/office/word/2012/wordml" xmlns:w16cid="http://schemas.microsoft.com/office/word/2016/wordml/cid" xmlns:w16se="http://schemas.microsoft.com/office/word/2015/wordml/symex" xmlns:wpg="http://schemas.microsoft.com/office/word/2010/wordprocessingGroup" xmlns:wpi="http://schemas.microsoft.com/office/word/2010/wordprocessingInk" xmlns:wne="http://schemas.microsoft.com/office/word/2006/wordml" xmlns:wps="http://schemas.microsoft.com/office/word/2010/wordprocessingShape" mc:Ignorable="w14 w15 w16se w16cid wp14">
+  <w:abstractNum w:abstractNumId="0" w15:restartNumberingAfterBreak="0">
+    <w:nsid w:val="44972504"/>
+    <w:multiLevelType w:val="multilevel"/>
+    <w:tmpl w:val="ABB4C5CC"/>
+    <w:lvl w:ilvl="0">
+      <w:start w:val="1"/>
+      <w:numFmt w:val="bullet"/>
+      <w:lvlText w:val=""/>
+      <w:lvlJc w:val="left"/>
+      <w:pPr>
+        <w:tabs>
+          <w:tab w:val="num" w:pos="720"/>
+        </w:tabs>
+        <w:ind w:left="720" w:hanging="360"/>
+      </w:pPr>
+      <w:rPr>
+        <w:rFonts w:ascii="Symbol" w:hAnsi="Symbol" w:hint="default"/>
+        <w:sz w:val="20"/>
+      </w:rPr>
+    </w:lvl>
+    <w:lvl w:ilvl="1" w:tentative="1">
+      <w:start w:val="1"/>
+      <w:numFmt w:val="bullet"/>
+      <w:lvlText w:val="o"/>
+      <w:lvlJc w:val="left"/>
+      <w:pPr>
+        <w:tabs>
+          <w:tab w:val="num" w:pos="1440"/>
+        </w:tabs>
+        <w:ind w:left="1440" w:hanging="360"/>
+      </w:pPr>
+      <w:rPr>
+        <w:rFonts w:ascii="Courier New" w:hAnsi="Courier New" w:hint="default"/>
+        <w:sz w:val="20"/>
+      </w:rPr>
+    </w:lvl>
+    <w:lvl w:ilvl="2" w:tentative="1">
+      <w:start w:val="1"/>
+      <w:numFmt w:val="bullet"/>
+      <w:lvlText w:val=""/>
+      <w:lvlJc w:val="left"/>
+      <w:pPr>
+        <w:tabs>
+          <w:tab w:val="num" w:pos="2160"/>
+        </w:tabs>
+        <w:ind w:left="2160" w:hanging="360"/>
+      </w:pPr>
+      <w:rPr>
+        <w:rFonts w:ascii="Wingdings" w:hAnsi="Wingdings" w:hint="default"/>
+        <w:sz w:val="20"/>
+      </w:rPr>
+    </w:lvl>
+    <w:lvl w:ilvl="3" w:tentative="1">
+      <w:start w:val="1"/>
+      <w:numFmt w:val="bullet"/>
+      <w:lvlText w:val=""/>
+      <w:lvlJc w:val="left"/>
+      <w:pPr>
+        <w:tabs>
+          <w:tab w:val="num" w:pos="2880"/>
+        </w:tabs>
+        <w:ind w:left="2880" w:hanging="360"/>
+      </w:pPr>
+      <w:rPr>
+        <w:rFonts w:ascii="Wingdings" w:hAnsi="Wingdings" w:hint="default"/>
+        <w:sz w:val="20"/>
+      </w:rPr>
+    </w:lvl>
+    <w:lvl w:ilvl="4" w:tentative="1">
+      <w:start w:val="1"/>
+      <w:numFmt w:val="bullet"/>
+      <w:lvlText w:val=""/>
+      <w:lvlJc w:val="left"/>
+      <w:pPr>
+        <w:tabs>
+          <w:tab w:val="num" w:pos="3600"/>
+        </w:tabs>
+        <w:ind w:left="3600" w:hanging="360"/>
+      </w:pPr>
+      <w:rPr>
+        <w:rFonts w:ascii="Wingdings" w:hAnsi="Wingdings" w:hint="default"/>
+        <w:sz w:val="20"/>
+      </w:rPr>
+    </w:lvl>
+    <w:lvl w:ilvl="5" w:tentative="1">
+      <w:start w:val="1"/>
+      <w:numFmt w:val="bullet"/>
+      <w:lvlText w:val=""/>
+      <w:lvlJc w:val="left"/>
+      <w:pPr>
+        <w:tabs>
+          <w:tab w:val="num" w:pos="4320"/>
+        </w:tabs>
+        <w:ind w:left="4320" w:hanging="360"/>
+      </w:pPr>
+      <w:rPr>
+        <w:rFonts w:ascii="Wingdings" w:hAnsi="Wingdings" w:hint="default"/>
+        <w:sz w:val="20"/>
+      </w:rPr>
+    </w:lvl>
+    <w:lvl w:ilvl="6" w:tentative="1">
+      <w:start w:val="1"/>
+      <w:numFmt w:val="bullet"/>
+      <w:lvlText w:val=""/>
+      <w:lvlJc w:val="left"/>
+      <w:pPr>
+        <w:tabs>
+          <w:tab w:val="num" w:pos="5040"/>
+        </w:tabs>
+        <w:ind w:left="5040" w:hanging="360"/>
+      </w:pPr>
+      <w:rPr>
+        <w:rFonts w:ascii="Wingdings" w:hAnsi="Wingdings" w:hint="default"/>
+        <w:sz w:val="20"/>
+      </w:rPr>
+    </w:lvl>
+    <w:lvl w:ilvl="7" w:tentative="1">
+      <w:start w:val="1"/>
+      <w:numFmt w:val="bullet"/>
+      <w:lvlText w:val=""/>
+      <w:lvlJc w:val="left"/>
+      <w:pPr>
+        <w:tabs>
+          <w:tab w:val="num" w:pos="5760"/>
+        </w:tabs>
+        <w:ind w:left="5760" w:hanging="360"/>
+      </w:pPr>
+      <w:rPr>
+        <w:rFonts w:ascii="Wingdings" w:hAnsi="Wingdings" w:hint="default"/>
+        <w:sz w:val="20"/>
+      </w:rPr>
+    </w:lvl>
+    <w:lvl w:ilvl="8" w:tentative="1">
+      <w:start w:val="1"/>
+      <w:numFmt w:val="bullet"/>
+      <w:lvlText w:val=""/>
+      <w:lvlJc w:val="left"/>
+      <w:pPr>
+        <w:tabs>
+          <w:tab w:val="num" w:pos="6480"/>
+        </w:tabs>
+        <w:ind w:left="6480" w:hanging="360"/>
+      </w:pPr>
+      <w:rPr>
+        <w:rFonts w:ascii="Wingdings" w:hAnsi="Wingdings" w:hint="default"/>
+        <w:sz w:val="20"/>
+      </w:rPr>
+    </w:lvl>
+  </w:abstractNum>
+  <w:num w:numId="1">
+    <w:abstractNumId w:val="0"/>
+  </w:num>
+</w:numbering>
 </file>
 
 <file path=word/styles.xml><?xml version="1.0" encoding="utf-8"?>
@@ -1302,10 +3565,53 @@
       <w:szCs w:val="28"/>
     </w:rPr>
   </w:style>
+  <w:style w:type="paragraph" w:styleId="Heading2">
+    <w:name w:val="heading 2"/>
+    <w:basedOn w:val="Normal"/>
+    <w:next w:val="Normal"/>
+    <w:link w:val="Heading2Char"/>
+    <w:uiPriority w:val="9"/>
+    <w:unhideWhenUsed/>
+    <w:qFormat/>
+    <w:rsid w:val="003D2EED"/>
+    <w:pPr>
+      <w:spacing w:before="100" w:beforeAutospacing="1" w:after="100" w:afterAutospacing="1" w:line="240" w:lineRule="auto"/>
+      <w:outlineLvl w:val="1"/>
+    </w:pPr>
+    <w:rPr>
+      <w:rFonts w:ascii="Times New Roman" w:eastAsia="Times New Roman" w:hAnsi="Times New Roman" w:cs="Times New Roman"/>
+      <w:b/>
+      <w:bCs/>
+      <w:sz w:val="24"/>
+      <w:szCs w:val="24"/>
+    </w:rPr>
+  </w:style>
+  <w:style w:type="paragraph" w:styleId="Heading3">
+    <w:name w:val="heading 3"/>
+    <w:basedOn w:val="Normal"/>
+    <w:next w:val="Normal"/>
+    <w:link w:val="Heading3Char"/>
+    <w:uiPriority w:val="9"/>
+    <w:semiHidden/>
+    <w:unhideWhenUsed/>
+    <w:qFormat/>
+    <w:rsid w:val="00512D10"/>
+    <w:pPr>
+      <w:keepNext/>
+      <w:keepLines/>
+      <w:spacing w:before="40" w:after="0"/>
+      <w:outlineLvl w:val="2"/>
+    </w:pPr>
+    <w:rPr>
+      <w:rFonts w:asciiTheme="majorHAnsi" w:eastAsiaTheme="majorEastAsia" w:hAnsiTheme="majorHAnsi" w:cstheme="majorBidi"/>
+      <w:color w:val="1F3763" w:themeColor="accent1" w:themeShade="7F"/>
+      <w:sz w:val="24"/>
+      <w:szCs w:val="24"/>
+    </w:rPr>
+  </w:style>
   <w:style w:type="character" w:default="1" w:styleId="DefaultParagraphFont">
     <w:name w:val="Default Paragraph Font"/>
     <w:uiPriority w:val="1"/>
-    <w:semiHidden/>
     <w:unhideWhenUsed/>
   </w:style>
   <w:style w:type="table" w:default="1" w:styleId="TableNormal">
@@ -1389,6 +3695,34 @@
       <w:bCs/>
       <w:sz w:val="28"/>
       <w:szCs w:val="28"/>
+    </w:rPr>
+  </w:style>
+  <w:style w:type="character" w:customStyle="1" w:styleId="Heading3Char">
+    <w:name w:val="Heading 3 Char"/>
+    <w:basedOn w:val="DefaultParagraphFont"/>
+    <w:link w:val="Heading3"/>
+    <w:uiPriority w:val="9"/>
+    <w:semiHidden/>
+    <w:rsid w:val="00512D10"/>
+    <w:rPr>
+      <w:rFonts w:asciiTheme="majorHAnsi" w:eastAsiaTheme="majorEastAsia" w:hAnsiTheme="majorHAnsi" w:cstheme="majorBidi"/>
+      <w:color w:val="1F3763" w:themeColor="accent1" w:themeShade="7F"/>
+      <w:sz w:val="24"/>
+      <w:szCs w:val="24"/>
+    </w:rPr>
+  </w:style>
+  <w:style w:type="character" w:customStyle="1" w:styleId="Heading2Char">
+    <w:name w:val="Heading 2 Char"/>
+    <w:basedOn w:val="DefaultParagraphFont"/>
+    <w:link w:val="Heading2"/>
+    <w:uiPriority w:val="9"/>
+    <w:rsid w:val="003D2EED"/>
+    <w:rPr>
+      <w:rFonts w:ascii="Times New Roman" w:eastAsia="Times New Roman" w:hAnsi="Times New Roman" w:cs="Times New Roman"/>
+      <w:b/>
+      <w:bCs/>
+      <w:sz w:val="24"/>
+      <w:szCs w:val="24"/>
     </w:rPr>
   </w:style>
 </w:styles>

</xml_diff>